<commit_message>
Port clean-up CIP: add Part B, switch management to VLAN 2000
Co-Authored-By: Claude Opus 5.5 <noreply@anthropic.com>
Claude-Session: https://claude.ai/code/session_01BZ7jJsE6GWKm6ehHY39VNr
</commit_message>
<xml_diff>
--- a/Trinity 200V Port Clean-up Change.docx
+++ b/Trinity 200V Port Clean-up Change.docx
@@ -17,7 +17,12 @@
     </w:p>
     <w:p>
       <w:r>
-        <w:t xml:space="preserve">Clean up 267 access ports on eight 200V switches as recommended by Trinity in column Q of Trinity_switch_ports_16-10-2026.xlsx (SmartZone export, 16 October 2026). Ports still on the old staff VLAN 1240 move to VL-staff-wired-01 (2100); unused ports still on old VLANs (mostly the old AV VLAN 1230) are returned to the default VLAN (VLAN 1); and old trunk (tagged) VLANs are removed from access ports where Trinity asked. 260 ports are in this change now; 7 wait for Trinity's answers to the review email of 21 October (see Prerequisites).</w:t>
+        <w:t xml:space="preserve">This change has two parts on the same eight 200V access switches. Part A cleans up access ports as recommended by Trinity. Part B moves each switch's management address from VLAN 100 (192.168.122.x) to VL-netmgmt-01, VLAN 2000 (10.21.0.x), so that all management traffic uses the new network. The two parts are independent and can be done in either order or in separate windows. The core switch, trinity200V-core, is not changed by either part.</w:t>
+      </w:r>
+    </w:p>
+    <w:p>
+      <w:r>
+        <w:t xml:space="preserve">Part A, port clean-up. Clean up 267 access ports on eight 200V switches as recommended by Trinity in column Q of Trinity_switch_ports_16-10-2026.xlsx (SmartZone export, 16 October 2026). Ports still on the old staff VLAN 1240 move to VL-staff-wired-01 (2100); unused ports still on old VLANs (mostly the old AV VLAN 1230) are returned to the default VLAN (VLAN 1); and old trunk (tagged) VLANs are removed from access ports where Trinity asked. 260 ports are in this change now; 7 wait for Trinity's answers to the review email of 21 October (see Prerequisites).</w:t>
       </w:r>
     </w:p>
     <w:p>
@@ -1233,6 +1238,752 @@
                 <w:szCs w:val="20"/>
               </w:rPr>
               <w:t xml:space="preserve">200V-port-review-16oct-ICX.txt (per switch: pre-check, change, port bounce, verify, rollback; pending blocks; optional port shutdown)</w:t>
+            </w:r>
+          </w:p>
+        </w:tc>
+      </w:tr>
+    </w:tbl>
+    <w:p>
+      <w:pPr>
+        <w:spacing w:after="80"/>
+      </w:pPr>
+    </w:p>
+    <w:p>
+      <w:r>
+        <w:t xml:space="preserve">Part B, switch management to VLAN 2000. Each switch gets an address on interface ve 2000 in 10.21.0.0/24; its default route moves from 192.168.120.1 to 10.21.0.1 (trinity200V-core ve 2000); 'management source-interface ve 2000 protocol all' makes every management protocol the switch originates (SmartZone, SNMP traps, NTP, DNS, SSH/telnet, TFTP/SCP) use the new address; and finally the 192.168.122.x address is removed from ve 100. VLAN 100 itself stays, as it is still tagged on ports and uplinks.</w:t>
+      </w:r>
+    </w:p>
+    <w:p>
+      <w:pPr>
+        <w:spacing w:after="80"/>
+      </w:pPr>
+    </w:p>
+    <w:tbl>
+      <w:tblPr>
+        <w:tblW w:w="9026" w:type="dxa"/>
+        <w:tblBorders>
+          <w:top w:val="single" w:sz="4" w:space="0" w:color="A6A6A6"/>
+          <w:left w:val="single" w:sz="4" w:space="0" w:color="A6A6A6"/>
+          <w:bottom w:val="single" w:sz="4" w:space="0" w:color="A6A6A6"/>
+          <w:right w:val="single" w:sz="4" w:space="0" w:color="A6A6A6"/>
+          <w:insideH w:val="single" w:sz="4" w:space="0" w:color="A6A6A6"/>
+          <w:insideV w:val="single" w:sz="4" w:space="0" w:color="A6A6A6"/>
+        </w:tblBorders>
+        <w:tblLayout w:type="fixed"/>
+        <w:tblCellMar>
+          <w:top w:w="40" w:type="dxa"/>
+          <w:left w:w="80" w:type="dxa"/>
+          <w:bottom w:w="40" w:type="dxa"/>
+          <w:right w:w="80" w:type="dxa"/>
+        </w:tblCellMar>
+      </w:tblPr>
+      <w:tblGrid>
+        <w:gridCol w:w="3610"/>
+        <w:gridCol w:w="2707"/>
+        <w:gridCol w:w="2709"/>
+      </w:tblGrid>
+      <w:tr>
+        <w:trPr>
+          <w:cantSplit/>
+          <w:tblHeader/>
+        </w:trPr>
+        <w:tc>
+          <w:tcPr>
+            <w:tcW w:w="3610" w:type="dxa"/>
+            <w:shd w:val="clear" w:color="auto" w:fill="D9D9D9"/>
+          </w:tcPr>
+          <w:p>
+            <w:pPr>
+              <w:spacing w:after="0" w:line="240" w:lineRule="auto"/>
+            </w:pPr>
+            <w:r>
+              <w:rPr>
+                <w:b/>
+                <w:bCs/>
+                <w:sz w:val="20"/>
+                <w:szCs w:val="20"/>
+              </w:rPr>
+              <w:t xml:space="preserve">Switch</w:t>
+            </w:r>
+          </w:p>
+        </w:tc>
+        <w:tc>
+          <w:tcPr>
+            <w:tcW w:w="2707" w:type="dxa"/>
+            <w:shd w:val="clear" w:color="auto" w:fill="D9D9D9"/>
+          </w:tcPr>
+          <w:p>
+            <w:pPr>
+              <w:spacing w:after="0" w:line="240" w:lineRule="auto"/>
+            </w:pPr>
+            <w:r>
+              <w:rPr>
+                <w:b/>
+                <w:bCs/>
+                <w:sz w:val="20"/>
+                <w:szCs w:val="20"/>
+              </w:rPr>
+              <w:t xml:space="preserve">Now (ve 100)</w:t>
+            </w:r>
+          </w:p>
+        </w:tc>
+        <w:tc>
+          <w:tcPr>
+            <w:tcW w:w="2709" w:type="dxa"/>
+            <w:shd w:val="clear" w:color="auto" w:fill="D9D9D9"/>
+          </w:tcPr>
+          <w:p>
+            <w:pPr>
+              <w:spacing w:after="0" w:line="240" w:lineRule="auto"/>
+            </w:pPr>
+            <w:r>
+              <w:rPr>
+                <w:b/>
+                <w:bCs/>
+                <w:sz w:val="20"/>
+                <w:szCs w:val="20"/>
+              </w:rPr>
+              <w:t xml:space="preserve">New (ve 2000)</w:t>
+            </w:r>
+          </w:p>
+        </w:tc>
+      </w:tr>
+      <w:tr>
+        <w:trPr>
+          <w:cantSplit/>
+        </w:trPr>
+        <w:tc>
+          <w:tcPr>
+            <w:tcW w:w="3610" w:type="dxa"/>
+          </w:tcPr>
+          <w:p>
+            <w:pPr>
+              <w:spacing w:after="0" w:line="240" w:lineRule="auto"/>
+            </w:pPr>
+            <w:r>
+              <w:rPr>
+                <w:sz w:val="20"/>
+                <w:szCs w:val="20"/>
+              </w:rPr>
+              <w:t xml:space="preserve">switch-200V-stack-lv6</w:t>
+            </w:r>
+          </w:p>
+        </w:tc>
+        <w:tc>
+          <w:tcPr>
+            <w:tcW w:w="2707" w:type="dxa"/>
+          </w:tcPr>
+          <w:p>
+            <w:pPr>
+              <w:spacing w:after="0" w:line="240" w:lineRule="auto"/>
+            </w:pPr>
+            <w:r>
+              <w:rPr>
+                <w:sz w:val="20"/>
+                <w:szCs w:val="20"/>
+              </w:rPr>
+              <w:t xml:space="preserve">192.168.122.11/22</w:t>
+            </w:r>
+          </w:p>
+        </w:tc>
+        <w:tc>
+          <w:tcPr>
+            <w:tcW w:w="2709" w:type="dxa"/>
+          </w:tcPr>
+          <w:p>
+            <w:pPr>
+              <w:spacing w:after="0" w:line="240" w:lineRule="auto"/>
+            </w:pPr>
+            <w:r>
+              <w:rPr>
+                <w:sz w:val="20"/>
+                <w:szCs w:val="20"/>
+              </w:rPr>
+              <w:t xml:space="preserve">10.21.0.20/24</w:t>
+            </w:r>
+          </w:p>
+        </w:tc>
+      </w:tr>
+      <w:tr>
+        <w:trPr>
+          <w:cantSplit/>
+        </w:trPr>
+        <w:tc>
+          <w:tcPr>
+            <w:tcW w:w="3610" w:type="dxa"/>
+          </w:tcPr>
+          <w:p>
+            <w:pPr>
+              <w:spacing w:after="0" w:line="240" w:lineRule="auto"/>
+            </w:pPr>
+            <w:r>
+              <w:rPr>
+                <w:sz w:val="20"/>
+                <w:szCs w:val="20"/>
+              </w:rPr>
+              <w:t xml:space="preserve">switch-200V-LT2-1</w:t>
+            </w:r>
+          </w:p>
+        </w:tc>
+        <w:tc>
+          <w:tcPr>
+            <w:tcW w:w="2707" w:type="dxa"/>
+          </w:tcPr>
+          <w:p>
+            <w:pPr>
+              <w:spacing w:after="0" w:line="240" w:lineRule="auto"/>
+            </w:pPr>
+            <w:r>
+              <w:rPr>
+                <w:sz w:val="20"/>
+                <w:szCs w:val="20"/>
+              </w:rPr>
+              <w:t xml:space="preserve">192.168.122.12/22</w:t>
+            </w:r>
+          </w:p>
+        </w:tc>
+        <w:tc>
+          <w:tcPr>
+            <w:tcW w:w="2709" w:type="dxa"/>
+          </w:tcPr>
+          <w:p>
+            <w:pPr>
+              <w:spacing w:after="0" w:line="240" w:lineRule="auto"/>
+            </w:pPr>
+            <w:r>
+              <w:rPr>
+                <w:sz w:val="20"/>
+                <w:szCs w:val="20"/>
+              </w:rPr>
+              <w:t xml:space="preserve">10.21.0.21/24</w:t>
+            </w:r>
+          </w:p>
+        </w:tc>
+      </w:tr>
+      <w:tr>
+        <w:trPr>
+          <w:cantSplit/>
+        </w:trPr>
+        <w:tc>
+          <w:tcPr>
+            <w:tcW w:w="3610" w:type="dxa"/>
+          </w:tcPr>
+          <w:p>
+            <w:pPr>
+              <w:spacing w:after="0" w:line="240" w:lineRule="auto"/>
+            </w:pPr>
+            <w:r>
+              <w:rPr>
+                <w:sz w:val="20"/>
+                <w:szCs w:val="20"/>
+              </w:rPr>
+              <w:t xml:space="preserve">switch-200V-LT2-2</w:t>
+            </w:r>
+          </w:p>
+        </w:tc>
+        <w:tc>
+          <w:tcPr>
+            <w:tcW w:w="2707" w:type="dxa"/>
+          </w:tcPr>
+          <w:p>
+            <w:pPr>
+              <w:spacing w:after="0" w:line="240" w:lineRule="auto"/>
+            </w:pPr>
+            <w:r>
+              <w:rPr>
+                <w:sz w:val="20"/>
+                <w:szCs w:val="20"/>
+              </w:rPr>
+              <w:t xml:space="preserve">192.168.122.13/22</w:t>
+            </w:r>
+          </w:p>
+        </w:tc>
+        <w:tc>
+          <w:tcPr>
+            <w:tcW w:w="2709" w:type="dxa"/>
+          </w:tcPr>
+          <w:p>
+            <w:pPr>
+              <w:spacing w:after="0" w:line="240" w:lineRule="auto"/>
+            </w:pPr>
+            <w:r>
+              <w:rPr>
+                <w:sz w:val="20"/>
+                <w:szCs w:val="20"/>
+              </w:rPr>
+              <w:t xml:space="preserve">10.21.0.22/24</w:t>
+            </w:r>
+          </w:p>
+        </w:tc>
+      </w:tr>
+      <w:tr>
+        <w:trPr>
+          <w:cantSplit/>
+        </w:trPr>
+        <w:tc>
+          <w:tcPr>
+            <w:tcW w:w="3610" w:type="dxa"/>
+          </w:tcPr>
+          <w:p>
+            <w:pPr>
+              <w:spacing w:after="0" w:line="240" w:lineRule="auto"/>
+            </w:pPr>
+            <w:r>
+              <w:rPr>
+                <w:sz w:val="20"/>
+                <w:szCs w:val="20"/>
+              </w:rPr>
+              <w:t xml:space="preserve">switch-200V-LT2-3</w:t>
+            </w:r>
+          </w:p>
+        </w:tc>
+        <w:tc>
+          <w:tcPr>
+            <w:tcW w:w="2707" w:type="dxa"/>
+          </w:tcPr>
+          <w:p>
+            <w:pPr>
+              <w:spacing w:after="0" w:line="240" w:lineRule="auto"/>
+            </w:pPr>
+            <w:r>
+              <w:rPr>
+                <w:sz w:val="20"/>
+                <w:szCs w:val="20"/>
+              </w:rPr>
+              <w:t xml:space="preserve">192.168.122.14/22</w:t>
+            </w:r>
+          </w:p>
+        </w:tc>
+        <w:tc>
+          <w:tcPr>
+            <w:tcW w:w="2709" w:type="dxa"/>
+          </w:tcPr>
+          <w:p>
+            <w:pPr>
+              <w:spacing w:after="0" w:line="240" w:lineRule="auto"/>
+            </w:pPr>
+            <w:r>
+              <w:rPr>
+                <w:sz w:val="20"/>
+                <w:szCs w:val="20"/>
+              </w:rPr>
+              <w:t xml:space="preserve">10.21.0.23/24</w:t>
+            </w:r>
+          </w:p>
+        </w:tc>
+      </w:tr>
+      <w:tr>
+        <w:trPr>
+          <w:cantSplit/>
+        </w:trPr>
+        <w:tc>
+          <w:tcPr>
+            <w:tcW w:w="3610" w:type="dxa"/>
+          </w:tcPr>
+          <w:p>
+            <w:pPr>
+              <w:spacing w:after="0" w:line="240" w:lineRule="auto"/>
+            </w:pPr>
+            <w:r>
+              <w:rPr>
+                <w:sz w:val="20"/>
+                <w:szCs w:val="20"/>
+              </w:rPr>
+              <w:t xml:space="preserve">switch-200V-Tutorial-6.03</w:t>
+            </w:r>
+          </w:p>
+        </w:tc>
+        <w:tc>
+          <w:tcPr>
+            <w:tcW w:w="2707" w:type="dxa"/>
+          </w:tcPr>
+          <w:p>
+            <w:pPr>
+              <w:spacing w:after="0" w:line="240" w:lineRule="auto"/>
+            </w:pPr>
+            <w:r>
+              <w:rPr>
+                <w:sz w:val="20"/>
+                <w:szCs w:val="20"/>
+              </w:rPr>
+              <w:t xml:space="preserve">192.168.122.15/22</w:t>
+            </w:r>
+          </w:p>
+        </w:tc>
+        <w:tc>
+          <w:tcPr>
+            <w:tcW w:w="2709" w:type="dxa"/>
+          </w:tcPr>
+          <w:p>
+            <w:pPr>
+              <w:spacing w:after="0" w:line="240" w:lineRule="auto"/>
+            </w:pPr>
+            <w:r>
+              <w:rPr>
+                <w:sz w:val="20"/>
+                <w:szCs w:val="20"/>
+              </w:rPr>
+              <w:t xml:space="preserve">10.21.0.24/24</w:t>
+            </w:r>
+          </w:p>
+        </w:tc>
+      </w:tr>
+      <w:tr>
+        <w:trPr>
+          <w:cantSplit/>
+        </w:trPr>
+        <w:tc>
+          <w:tcPr>
+            <w:tcW w:w="3610" w:type="dxa"/>
+          </w:tcPr>
+          <w:p>
+            <w:pPr>
+              <w:spacing w:after="0" w:line="240" w:lineRule="auto"/>
+            </w:pPr>
+            <w:r>
+              <w:rPr>
+                <w:sz w:val="20"/>
+                <w:szCs w:val="20"/>
+              </w:rPr>
+              <w:t xml:space="preserve">switch-200V-8</w:t>
+            </w:r>
+          </w:p>
+        </w:tc>
+        <w:tc>
+          <w:tcPr>
+            <w:tcW w:w="2707" w:type="dxa"/>
+          </w:tcPr>
+          <w:p>
+            <w:pPr>
+              <w:spacing w:after="0" w:line="240" w:lineRule="auto"/>
+            </w:pPr>
+            <w:r>
+              <w:rPr>
+                <w:sz w:val="20"/>
+                <w:szCs w:val="20"/>
+              </w:rPr>
+              <w:t xml:space="preserve">192.168.122.16/22</w:t>
+            </w:r>
+          </w:p>
+        </w:tc>
+        <w:tc>
+          <w:tcPr>
+            <w:tcW w:w="2709" w:type="dxa"/>
+          </w:tcPr>
+          <w:p>
+            <w:pPr>
+              <w:spacing w:after="0" w:line="240" w:lineRule="auto"/>
+            </w:pPr>
+            <w:r>
+              <w:rPr>
+                <w:sz w:val="20"/>
+                <w:szCs w:val="20"/>
+              </w:rPr>
+              <w:t xml:space="preserve">10.21.0.25/24</w:t>
+            </w:r>
+          </w:p>
+        </w:tc>
+      </w:tr>
+      <w:tr>
+        <w:trPr>
+          <w:cantSplit/>
+        </w:trPr>
+        <w:tc>
+          <w:tcPr>
+            <w:tcW w:w="3610" w:type="dxa"/>
+          </w:tcPr>
+          <w:p>
+            <w:pPr>
+              <w:spacing w:after="0" w:line="240" w:lineRule="auto"/>
+            </w:pPr>
+            <w:r>
+              <w:rPr>
+                <w:sz w:val="20"/>
+                <w:szCs w:val="20"/>
+              </w:rPr>
+              <w:t xml:space="preserve">switch-200V-stack-lv4</w:t>
+            </w:r>
+          </w:p>
+        </w:tc>
+        <w:tc>
+          <w:tcPr>
+            <w:tcW w:w="2707" w:type="dxa"/>
+          </w:tcPr>
+          <w:p>
+            <w:pPr>
+              <w:spacing w:after="0" w:line="240" w:lineRule="auto"/>
+            </w:pPr>
+            <w:r>
+              <w:rPr>
+                <w:sz w:val="20"/>
+                <w:szCs w:val="20"/>
+              </w:rPr>
+              <w:t xml:space="preserve">192.168.122.21/22</w:t>
+            </w:r>
+          </w:p>
+        </w:tc>
+        <w:tc>
+          <w:tcPr>
+            <w:tcW w:w="2709" w:type="dxa"/>
+          </w:tcPr>
+          <w:p>
+            <w:pPr>
+              <w:spacing w:after="0" w:line="240" w:lineRule="auto"/>
+            </w:pPr>
+            <w:r>
+              <w:rPr>
+                <w:sz w:val="20"/>
+                <w:szCs w:val="20"/>
+              </w:rPr>
+              <w:t xml:space="preserve">10.21.0.26/24</w:t>
+            </w:r>
+          </w:p>
+        </w:tc>
+      </w:tr>
+      <w:tr>
+        <w:trPr>
+          <w:cantSplit/>
+        </w:trPr>
+        <w:tc>
+          <w:tcPr>
+            <w:tcW w:w="3610" w:type="dxa"/>
+          </w:tcPr>
+          <w:p>
+            <w:pPr>
+              <w:spacing w:after="0" w:line="240" w:lineRule="auto"/>
+            </w:pPr>
+            <w:r>
+              <w:rPr>
+                <w:sz w:val="20"/>
+                <w:szCs w:val="20"/>
+              </w:rPr>
+              <w:t xml:space="preserve">switch-200V-stack-lv3</w:t>
+            </w:r>
+          </w:p>
+        </w:tc>
+        <w:tc>
+          <w:tcPr>
+            <w:tcW w:w="2707" w:type="dxa"/>
+          </w:tcPr>
+          <w:p>
+            <w:pPr>
+              <w:spacing w:after="0" w:line="240" w:lineRule="auto"/>
+            </w:pPr>
+            <w:r>
+              <w:rPr>
+                <w:sz w:val="20"/>
+                <w:szCs w:val="20"/>
+              </w:rPr>
+              <w:t xml:space="preserve">192.168.122.22/22</w:t>
+            </w:r>
+          </w:p>
+        </w:tc>
+        <w:tc>
+          <w:tcPr>
+            <w:tcW w:w="2709" w:type="dxa"/>
+          </w:tcPr>
+          <w:p>
+            <w:pPr>
+              <w:spacing w:after="0" w:line="240" w:lineRule="auto"/>
+            </w:pPr>
+            <w:r>
+              <w:rPr>
+                <w:sz w:val="20"/>
+                <w:szCs w:val="20"/>
+              </w:rPr>
+              <w:t xml:space="preserve">10.21.0.27/24</w:t>
+            </w:r>
+          </w:p>
+        </w:tc>
+      </w:tr>
+    </w:tbl>
+    <w:p>
+      <w:pPr>
+        <w:spacing w:after="80"/>
+      </w:pPr>
+    </w:p>
+    <w:tbl>
+      <w:tblPr>
+        <w:tblW w:w="9026" w:type="dxa"/>
+        <w:tblBorders>
+          <w:top w:val="single" w:sz="4" w:space="0" w:color="A6A6A6"/>
+          <w:left w:val="single" w:sz="4" w:space="0" w:color="A6A6A6"/>
+          <w:bottom w:val="single" w:sz="4" w:space="0" w:color="A6A6A6"/>
+          <w:right w:val="single" w:sz="4" w:space="0" w:color="A6A6A6"/>
+          <w:insideH w:val="single" w:sz="4" w:space="0" w:color="A6A6A6"/>
+          <w:insideV w:val="single" w:sz="4" w:space="0" w:color="A6A6A6"/>
+        </w:tblBorders>
+        <w:tblLayout w:type="fixed"/>
+        <w:tblCellMar>
+          <w:top w:w="40" w:type="dxa"/>
+          <w:left w:w="80" w:type="dxa"/>
+          <w:bottom w:w="40" w:type="dxa"/>
+          <w:right w:w="80" w:type="dxa"/>
+        </w:tblCellMar>
+      </w:tblPr>
+      <w:tblGrid>
+        <w:gridCol w:w="2527"/>
+        <w:gridCol w:w="6499"/>
+      </w:tblGrid>
+      <w:tr>
+        <w:trPr>
+          <w:cantSplit/>
+          <w:tblHeader/>
+        </w:trPr>
+        <w:tc>
+          <w:tcPr>
+            <w:tcW w:w="2527" w:type="dxa"/>
+            <w:shd w:val="clear" w:color="auto" w:fill="D9D9D9"/>
+          </w:tcPr>
+          <w:p>
+            <w:pPr>
+              <w:spacing w:after="0" w:line="240" w:lineRule="auto"/>
+            </w:pPr>
+            <w:r>
+              <w:rPr>
+                <w:b/>
+                <w:bCs/>
+                <w:sz w:val="20"/>
+                <w:szCs w:val="20"/>
+              </w:rPr>
+              <w:t xml:space="preserve">Item</w:t>
+            </w:r>
+          </w:p>
+        </w:tc>
+        <w:tc>
+          <w:tcPr>
+            <w:tcW w:w="6499" w:type="dxa"/>
+            <w:shd w:val="clear" w:color="auto" w:fill="D9D9D9"/>
+          </w:tcPr>
+          <w:p>
+            <w:pPr>
+              <w:spacing w:after="0" w:line="240" w:lineRule="auto"/>
+            </w:pPr>
+            <w:r>
+              <w:rPr>
+                <w:b/>
+                <w:bCs/>
+                <w:sz w:val="20"/>
+                <w:szCs w:val="20"/>
+              </w:rPr>
+              <w:t xml:space="preserve">Value</w:t>
+            </w:r>
+          </w:p>
+        </w:tc>
+      </w:tr>
+      <w:tr>
+        <w:trPr>
+          <w:cantSplit/>
+        </w:trPr>
+        <w:tc>
+          <w:tcPr>
+            <w:tcW w:w="2527" w:type="dxa"/>
+          </w:tcPr>
+          <w:p>
+            <w:pPr>
+              <w:spacing w:after="0" w:line="240" w:lineRule="auto"/>
+            </w:pPr>
+            <w:r>
+              <w:rPr>
+                <w:sz w:val="20"/>
+                <w:szCs w:val="20"/>
+              </w:rPr>
+              <w:t xml:space="preserve">Gateway</w:t>
+            </w:r>
+          </w:p>
+        </w:tc>
+        <w:tc>
+          <w:tcPr>
+            <w:tcW w:w="6499" w:type="dxa"/>
+          </w:tcPr>
+          <w:p>
+            <w:pPr>
+              <w:spacing w:after="0" w:line="240" w:lineRule="auto"/>
+            </w:pPr>
+            <w:r>
+              <w:rPr>
+                <w:sz w:val="20"/>
+                <w:szCs w:val="20"/>
+              </w:rPr>
+              <w:t xml:space="preserve">10.21.0.1, interface ve 2000 on trinity200V-core (no ACL on VLAN 2000)</w:t>
+            </w:r>
+          </w:p>
+        </w:tc>
+      </w:tr>
+      <w:tr>
+        <w:trPr>
+          <w:cantSplit/>
+        </w:trPr>
+        <w:tc>
+          <w:tcPr>
+            <w:tcW w:w="2527" w:type="dxa"/>
+          </w:tcPr>
+          <w:p>
+            <w:pPr>
+              <w:spacing w:after="0" w:line="240" w:lineRule="auto"/>
+            </w:pPr>
+            <w:r>
+              <w:rPr>
+                <w:sz w:val="20"/>
+                <w:szCs w:val="20"/>
+              </w:rPr>
+              <w:t xml:space="preserve">Unchanged</w:t>
+            </w:r>
+          </w:p>
+        </w:tc>
+        <w:tc>
+          <w:tcPr>
+            <w:tcW w:w="6499" w:type="dxa"/>
+          </w:tcPr>
+          <w:p>
+            <w:pPr>
+              <w:spacing w:after="0" w:line="240" w:lineRule="auto"/>
+            </w:pPr>
+            <w:r>
+              <w:rPr>
+                <w:sz w:val="20"/>
+                <w:szCs w:val="20"/>
+              </w:rPr>
+              <w:t xml:space="preserve">trinity200V-core (management stays on ve 1960, 10.20.8.2), VLANs, ports, ACLs, SmartZone active-list, SNMP and NTP settings</w:t>
+            </w:r>
+          </w:p>
+        </w:tc>
+      </w:tr>
+      <w:tr>
+        <w:trPr>
+          <w:cantSplit/>
+        </w:trPr>
+        <w:tc>
+          <w:tcPr>
+            <w:tcW w:w="2527" w:type="dxa"/>
+          </w:tcPr>
+          <w:p>
+            <w:pPr>
+              <w:spacing w:after="0" w:line="240" w:lineRule="auto"/>
+            </w:pPr>
+            <w:r>
+              <w:rPr>
+                <w:sz w:val="20"/>
+                <w:szCs w:val="20"/>
+              </w:rPr>
+              <w:t xml:space="preserve">Configuration file</w:t>
+            </w:r>
+          </w:p>
+        </w:tc>
+        <w:tc>
+          <w:tcPr>
+            <w:tcW w:w="6499" w:type="dxa"/>
+          </w:tcPr>
+          <w:p>
+            <w:pPr>
+              <w:spacing w:after="0" w:line="240" w:lineRule="auto"/>
+            </w:pPr>
+            <w:r>
+              <w:rPr>
+                <w:sz w:val="20"/>
+                <w:szCs w:val="20"/>
+              </w:rPr>
+              <w:t xml:space="preserve">200V-mgmt-ve2000-ICX.txt (core pre-check; per switch: pre-check, add ve 2000, connect from the core, route and source-interface, verify, remove old address, rollback)</w:t>
             </w:r>
           </w:p>
         </w:tc>
@@ -1318,6 +2069,32 @@
     </w:p>
     <w:p>
       <w:pPr>
+        <w:pStyle w:val="ListParagraph"/>
+        <w:numPr>
+          <w:ilvl w:val="0"/>
+          <w:numId w:val="1"/>
+        </w:numPr>
+        <w:spacing w:after="60"/>
+      </w:pPr>
+      <w:r>
+        <w:t xml:space="preserve">Part B: no impact on users or devices; only switch management traffic moves. Each switch's SmartZone connection drops and re-forms from its new address (up to 5 minutes), and a CLI session to the old 192.168.122.x address drops when the default route changes</w:t>
+      </w:r>
+    </w:p>
+    <w:p>
+      <w:pPr>
+        <w:pStyle w:val="ListParagraph"/>
+        <w:numPr>
+          <w:ilvl w:val="0"/>
+          <w:numId w:val="1"/>
+        </w:numPr>
+        <w:spacing w:after="60"/>
+      </w:pPr>
+      <w:r>
+        <w:t xml:space="preserve">Part B: after the change the switches are managed on 10.21.0.20 - .27. Until the SRX allows the admin jump host and the SNMP server to reach 10.21.0.0/24 (see Prerequisites), they can only be reached through SmartZone or from trinity200V-core, and SNMP monitoring of them stops</w:t>
+      </w:r>
+    </w:p>
+    <w:p>
+      <w:pPr>
         <w:keepNext/>
         <w:spacing w:before="240" w:after="120"/>
       </w:pPr>
@@ -1331,7 +2108,7 @@
     </w:p>
     <w:p>
       <w:r>
-        <w:t xml:space="preserve">About 30 seconds for each of the ports that are up, while it is bounced and spanning tree forwards on 2100. The whole change takes about 1 hour to paste and verify across the eight switches.</w:t>
+        <w:t xml:space="preserve">About 30 seconds for each of the ports that are up, while it is bounced and spanning tree forwards on 2100. Part A takes about 1 hour to paste and verify across the eight switches. Part B has no user impact and takes about 10 minutes per switch, mostly waiting for SmartZone to reconnect (about 1.5 hours in total).</w:t>
       </w:r>
     </w:p>
     <w:p>
@@ -1350,6 +2127,11 @@
     <w:p>
       <w:r>
         <w:t xml:space="preserve">The change will be implemented by Alam Singh (Dycom) over SSH/telnet to each switch, using 200V-port-review-16oct-ICX.txt. For each switch the pre-check confirms the ports are still as exported on 16 October; the change removes the old untagged VLAN, adds 2100 untagged where required and removes the old tagged VLANs where required; ports that were up are bounced so their devices renew DHCP; the result is verified and saved. The same method was used for the 9 October cutover.</w:t>
+      </w:r>
+    </w:p>
+    <w:p>
+      <w:r>
+        <w:t xml:space="preserve">Part B is implemented from a session on trinity200V-core. The core is directly connected to 10.21.0.0/24, so after the new address is added a telnet session from the core to 10.21.0.x keeps working while the switch's default route and management source are changed. switch-200V-Tutorial-6.03 is done first as a pilot.</w:t>
       </w:r>
     </w:p>
     <w:p>
@@ -1471,6 +2253,71 @@
     </w:p>
     <w:p>
       <w:pPr>
+        <w:pStyle w:val="ListParagraph"/>
+        <w:numPr>
+          <w:ilvl w:val="0"/>
+          <w:numId w:val="4"/>
+        </w:numPr>
+        <w:spacing w:after="60"/>
+      </w:pPr>
+      <w:r>
+        <w:t xml:space="preserve">Part B: on trinity200V-core run the core PRE-CHECK; ping 10.21.0.20 - .27 must get no reply.</w:t>
+      </w:r>
+    </w:p>
+    <w:p>
+      <w:pPr>
+        <w:pStyle w:val="ListParagraph"/>
+        <w:numPr>
+          <w:ilvl w:val="0"/>
+          <w:numId w:val="4"/>
+        </w:numPr>
+        <w:spacing w:after="60"/>
+      </w:pPr>
+      <w:r>
+        <w:t xml:space="preserve">Part B, per switch (Tutorial-6.03 first): run the switch PRE-CHECK, then STEP 1 (add ve 2000) and ping 10.21.0.1.</w:t>
+      </w:r>
+    </w:p>
+    <w:p>
+      <w:pPr>
+        <w:pStyle w:val="ListParagraph"/>
+        <w:numPr>
+          <w:ilvl w:val="0"/>
+          <w:numId w:val="4"/>
+        </w:numPr>
+        <w:spacing w:after="60"/>
+      </w:pPr>
+      <w:r>
+        <w:t xml:space="preserve">Part B: from trinity200V-core, telnet to the new address (STEP 2) and paste STEP 3 (default route via 10.21.0.1 and management source-interface ve 2000).</w:t>
+      </w:r>
+    </w:p>
+    <w:p>
+      <w:pPr>
+        <w:pStyle w:val="ListParagraph"/>
+        <w:numPr>
+          <w:ilvl w:val="0"/>
+          <w:numId w:val="4"/>
+        </w:numPr>
+        <w:spacing w:after="60"/>
+      </w:pPr>
+      <w:r>
+        <w:t xml:space="preserve">Part B: VERIFY: one default route via 10.21.0.1, replies from 10.21.0.1, DNS and SmartZone, and show manager status connected; then write memory.</w:t>
+      </w:r>
+    </w:p>
+    <w:p>
+      <w:pPr>
+        <w:pStyle w:val="ListParagraph"/>
+        <w:numPr>
+          <w:ilvl w:val="0"/>
+          <w:numId w:val="4"/>
+        </w:numPr>
+        <w:spacing w:after="60"/>
+      </w:pPr>
+      <w:r>
+        <w:t xml:space="preserve">Part B: when SmartZone shows the switch on its new address, paste STEP 4 to remove the 192.168.122.x address, check show ip interface lists only ve 2000, and write memory.</w:t>
+      </w:r>
+    </w:p>
+    <w:p>
+      <w:pPr>
         <w:keepNext/>
         <w:spacing w:before="240" w:after="120"/>
       </w:pPr>
@@ -1824,6 +2671,201 @@
           </w:p>
         </w:tc>
       </w:tr>
+      <w:tr>
+        <w:trPr>
+          <w:cantSplit/>
+        </w:trPr>
+        <w:tc>
+          <w:tcPr>
+            <w:tcW w:w="7026" w:type="dxa"/>
+          </w:tcPr>
+          <w:p>
+            <w:pPr>
+              <w:spacing w:after="0" w:line="240" w:lineRule="auto"/>
+            </w:pPr>
+            <w:r>
+              <w:rPr>
+                <w:sz w:val="20"/>
+                <w:szCs w:val="20"/>
+              </w:rPr>
+              <w:t xml:space="preserve">Part B: 10.21.0.20 - 10.21.0.27 excluded from the 10.21.0.0/24 DHCP scope on 10.20.16.10 / 10.20.16.11</w:t>
+            </w:r>
+          </w:p>
+        </w:tc>
+        <w:tc>
+          <w:tcPr>
+            <w:tcW w:w="2000" w:type="dxa"/>
+          </w:tcPr>
+          <w:p>
+            <w:pPr>
+              <w:spacing w:after="0" w:line="240" w:lineRule="auto"/>
+            </w:pPr>
+            <w:r>
+              <w:rPr>
+                <w:sz w:val="20"/>
+                <w:szCs w:val="20"/>
+              </w:rPr>
+              <w:t xml:space="preserve">Pending Trinity</w:t>
+            </w:r>
+          </w:p>
+        </w:tc>
+      </w:tr>
+      <w:tr>
+        <w:trPr>
+          <w:cantSplit/>
+        </w:trPr>
+        <w:tc>
+          <w:tcPr>
+            <w:tcW w:w="7026" w:type="dxa"/>
+          </w:tcPr>
+          <w:p>
+            <w:pPr>
+              <w:spacing w:after="0" w:line="240" w:lineRule="auto"/>
+            </w:pPr>
+            <w:r>
+              <w:rPr>
+                <w:sz w:val="20"/>
+                <w:szCs w:val="20"/>
+              </w:rPr>
+              <w:t xml:space="preserve">Part B: SRX policy to allow the admin jump host (10.128.132.10) to reach 10.21.0.0/24 by SSH/telnet, and SNMP between 10.21.0.0/24 and 10.128.240.12. Not in the Sparx policy report; without it the switches are managed through SmartZone or from the core only</w:t>
+            </w:r>
+          </w:p>
+        </w:tc>
+        <w:tc>
+          <w:tcPr>
+            <w:tcW w:w="2000" w:type="dxa"/>
+          </w:tcPr>
+          <w:p>
+            <w:pPr>
+              <w:spacing w:after="0" w:line="240" w:lineRule="auto"/>
+            </w:pPr>
+            <w:r>
+              <w:rPr>
+                <w:sz w:val="20"/>
+                <w:szCs w:val="20"/>
+              </w:rPr>
+              <w:t xml:space="preserve">Pending decision</w:t>
+            </w:r>
+          </w:p>
+        </w:tc>
+      </w:tr>
+      <w:tr>
+        <w:trPr>
+          <w:cantSplit/>
+        </w:trPr>
+        <w:tc>
+          <w:tcPr>
+            <w:tcW w:w="7026" w:type="dxa"/>
+          </w:tcPr>
+          <w:p>
+            <w:pPr>
+              <w:spacing w:after="0" w:line="240" w:lineRule="auto"/>
+            </w:pPr>
+            <w:r>
+              <w:rPr>
+                <w:sz w:val="20"/>
+                <w:szCs w:val="20"/>
+              </w:rPr>
+              <w:t xml:space="preserve">Part B: ntp1.trinity.unimelb.edu.au resolves to one of the NTP servers the SRX allows for 10.21.0.0/24</w:t>
+            </w:r>
+          </w:p>
+        </w:tc>
+        <w:tc>
+          <w:tcPr>
+            <w:tcW w:w="2000" w:type="dxa"/>
+          </w:tcPr>
+          <w:p>
+            <w:pPr>
+              <w:spacing w:after="0" w:line="240" w:lineRule="auto"/>
+            </w:pPr>
+            <w:r>
+              <w:rPr>
+                <w:sz w:val="20"/>
+                <w:szCs w:val="20"/>
+              </w:rPr>
+              <w:t xml:space="preserve">Pending check</w:t>
+            </w:r>
+          </w:p>
+        </w:tc>
+      </w:tr>
+      <w:tr>
+        <w:trPr>
+          <w:cantSplit/>
+        </w:trPr>
+        <w:tc>
+          <w:tcPr>
+            <w:tcW w:w="7026" w:type="dxa"/>
+          </w:tcPr>
+          <w:p>
+            <w:pPr>
+              <w:spacing w:after="0" w:line="240" w:lineRule="auto"/>
+            </w:pPr>
+            <w:r>
+              <w:rPr>
+                <w:sz w:val="20"/>
+                <w:szCs w:val="20"/>
+              </w:rPr>
+              <w:t xml:space="preserve">Part B: VLAN 2000 tagged on every switch uplink and ve 2000 10.21.0.1/24 on the core (checked in the 16 October export and the 12 October core configuration)</w:t>
+            </w:r>
+          </w:p>
+        </w:tc>
+        <w:tc>
+          <w:tcPr>
+            <w:tcW w:w="2000" w:type="dxa"/>
+          </w:tcPr>
+          <w:p>
+            <w:pPr>
+              <w:spacing w:after="0" w:line="240" w:lineRule="auto"/>
+            </w:pPr>
+            <w:r>
+              <w:rPr>
+                <w:sz w:val="20"/>
+                <w:szCs w:val="20"/>
+              </w:rPr>
+              <w:t xml:space="preserve">Complete</w:t>
+            </w:r>
+          </w:p>
+        </w:tc>
+      </w:tr>
+      <w:tr>
+        <w:trPr>
+          <w:cantSplit/>
+        </w:trPr>
+        <w:tc>
+          <w:tcPr>
+            <w:tcW w:w="7026" w:type="dxa"/>
+          </w:tcPr>
+          <w:p>
+            <w:pPr>
+              <w:spacing w:after="0" w:line="240" w:lineRule="auto"/>
+            </w:pPr>
+            <w:r>
+              <w:rPr>
+                <w:sz w:val="20"/>
+                <w:szCs w:val="20"/>
+              </w:rPr>
+              <w:t xml:space="preserve">Part B: SRX allows 10.21.0.0/24 to SmartZone (192.168.245.0/24, 192.168.81.0/24), SmartZone back to it, DNS 10.128.128.31/.60 and the Internet (Sparx policy report)</w:t>
+            </w:r>
+          </w:p>
+        </w:tc>
+        <w:tc>
+          <w:tcPr>
+            <w:tcW w:w="2000" w:type="dxa"/>
+          </w:tcPr>
+          <w:p>
+            <w:pPr>
+              <w:spacing w:after="0" w:line="240" w:lineRule="auto"/>
+            </w:pPr>
+            <w:r>
+              <w:rPr>
+                <w:sz w:val="20"/>
+                <w:szCs w:val="20"/>
+              </w:rPr>
+              <w:t xml:space="preserve">Complete</w:t>
+            </w:r>
+          </w:p>
+        </w:tc>
+      </w:tr>
     </w:tbl>
     <w:p>
       <w:pPr>
@@ -1841,6 +2883,11 @@
     <w:p>
       <w:r>
         <w:t xml:space="preserve">Each switch has a ROLLBACK block in 200V-port-review-16oct-ICX.txt that puts every port back exactly as it was on 16 October (old untagged VLAN and old tagged VLANs). Paste it, bounce the ports that were up, and write memory. A single port can be rolled back by pasting only its lines.</w:t>
+      </w:r>
+    </w:p>
+    <w:p>
+      <w:r>
+        <w:t xml:space="preserve">Part B: each switch has a ROLLBACK block in 200V-mgmt-ve2000-ICX.txt, pasted from the core-hop session. It puts back the 192.168.122.x address on ve 100, the default route via 192.168.120.1 and the original management source; then, from a session to the old address, the ve 2000 address is removed.</w:t>
       </w:r>
     </w:p>
     <w:p>
@@ -1893,6 +2940,19 @@
       </w:pPr>
       <w:r>
         <w:t xml:space="preserve">Trinity asks for a rollback</w:t>
+      </w:r>
+    </w:p>
+    <w:p>
+      <w:pPr>
+        <w:pStyle w:val="ListParagraph"/>
+        <w:numPr>
+          <w:ilvl w:val="0"/>
+          <w:numId w:val="1"/>
+        </w:numPr>
+        <w:spacing w:after="60"/>
+      </w:pPr>
+      <w:r>
+        <w:t xml:space="preserve">Part B: a switch does not reconnect to SmartZone from its new address within 10 minutes, or cannot reach 10.21.0.1</w:t>
       </w:r>
     </w:p>
     <w:p>
@@ -1962,6 +3022,45 @@
     </w:p>
     <w:p>
       <w:pPr>
+        <w:pStyle w:val="ListParagraph"/>
+        <w:numPr>
+          <w:ilvl w:val="0"/>
+          <w:numId w:val="1"/>
+        </w:numPr>
+        <w:spacing w:after="60"/>
+      </w:pPr>
+      <w:r>
+        <w:t xml:space="preserve">Part B: show ip interface lists only ve 2000 (10.21.0.x); show ip route has one default route via 10.21.0.1; show running-config shows management source-interface ve 2000 protocol all</w:t>
+      </w:r>
+    </w:p>
+    <w:p>
+      <w:pPr>
+        <w:pStyle w:val="ListParagraph"/>
+        <w:numPr>
+          <w:ilvl w:val="0"/>
+          <w:numId w:val="1"/>
+        </w:numPr>
+        <w:spacing w:after="60"/>
+      </w:pPr>
+      <w:r>
+        <w:t xml:space="preserve">Part B: SmartZone shows all eight switches online with their 10.21.0.x address</w:t>
+      </w:r>
+    </w:p>
+    <w:p>
+      <w:pPr>
+        <w:pStyle w:val="ListParagraph"/>
+        <w:numPr>
+          <w:ilvl w:val="0"/>
+          <w:numId w:val="1"/>
+        </w:numPr>
+        <w:spacing w:after="60"/>
+      </w:pPr>
+      <w:r>
+        <w:t xml:space="preserve">Part B: show ntp associations shows the NTP server reachable</w:t>
+      </w:r>
+    </w:p>
+    <w:p>
+      <w:pPr>
         <w:keepNext/>
         <w:spacing w:before="240" w:after="120"/>
       </w:pPr>
@@ -2027,6 +3126,45 @@
     </w:p>
     <w:p>
       <w:pPr>
+        <w:pStyle w:val="ListParagraph"/>
+        <w:numPr>
+          <w:ilvl w:val="0"/>
+          <w:numId w:val="5"/>
+        </w:numPr>
+        <w:spacing w:after="60"/>
+      </w:pPr>
+      <w:r>
+        <w:t xml:space="preserve">Part B: if a switch's new address cannot reach 10.21.0.1 (VLAN 2000 not carried end to end), then the switch loses management when the default route changes. This has low likelihood because STEP 1 tests the ping before STEP 3. If this risk occurs, the old session is still open: paste the ROLLBACK.</w:t>
+      </w:r>
+    </w:p>
+    <w:p>
+      <w:pPr>
+        <w:pStyle w:val="ListParagraph"/>
+        <w:numPr>
+          <w:ilvl w:val="0"/>
+          <w:numId w:val="5"/>
+        </w:numPr>
+        <w:spacing w:after="60"/>
+      </w:pPr>
+      <w:r>
+        <w:t xml:space="preserve">Part B: if the SRX does not allow the admin jump host and SNMP server to 10.21.0.0/24, then direct SSH and SNMP monitoring stop. This is likely until a policy is added. If this risk occurs, manage the switches through SmartZone or from trinity200V-core.</w:t>
+      </w:r>
+    </w:p>
+    <w:p>
+      <w:pPr>
+        <w:pStyle w:val="ListParagraph"/>
+        <w:numPr>
+          <w:ilvl w:val="0"/>
+          <w:numId w:val="5"/>
+        </w:numPr>
+        <w:spacing w:after="60"/>
+      </w:pPr>
+      <w:r>
+        <w:t xml:space="preserve">Part B: while both ve 100 and ve 2000 have an address the switch can route between 192.168.120.0/22 and 10.21.0.0/24. This has low likelihood of use and lasts only until STEP 4.</w:t>
+      </w:r>
+    </w:p>
+    <w:p>
+      <w:pPr>
         <w:keepNext/>
         <w:spacing w:before="240" w:after="120"/>
       </w:pPr>
@@ -2040,7 +3178,7 @@
     </w:p>
     <w:p>
       <w:r>
-        <w:t xml:space="preserve">Early morning or after hours, about 1 hour, once Trinity have approved the change and answered items 1 to 3. The ports that are down can be done at any time.</w:t>
+        <w:t xml:space="preserve">Early morning or after hours, about 1 hour, once Trinity have approved the change and answered items 1 to 3. The ports that are down can be done at any time. Part B can be done in business hours (no user impact) once the DHCP exclusion is confirmed and the SRX access decision is made.</w:t>
       </w:r>
     </w:p>
     <w:p>

</xml_diff>

<commit_message>
Part B: DHCP exclusion for 10.21.0.20-.27 confirmed by Trinity
Co-Authored-By: Claude Opus 5.5 <noreply@anthropic.com>
Claude-Session: https://claude.ai/code/session_01BZ7jJsE6GWKm6ehHY39VNr
</commit_message>
<xml_diff>
--- a/Trinity 200V Port Clean-up Change.docx
+++ b/Trinity 200V Port Clean-up Change.docx
@@ -2705,7 +2705,7 @@
                 <w:sz w:val="20"/>
                 <w:szCs w:val="20"/>
               </w:rPr>
-              <w:t xml:space="preserve">Pending Trinity</w:t>
+              <w:t xml:space="preserve">Complete (confirmed by Trinity 22 October)</w:t>
             </w:r>
           </w:p>
         </w:tc>
@@ -3178,7 +3178,7 @@
     </w:p>
     <w:p>
       <w:r>
-        <w:t xml:space="preserve">Early morning or after hours, about 1 hour, once Trinity have approved the change and answered items 1 to 3. The ports that are down can be done at any time. Part B can be done in business hours (no user impact) once the DHCP exclusion is confirmed and the SRX access decision is made.</w:t>
+        <w:t xml:space="preserve">Early morning or after hours, about 1 hour, once Trinity have approved the change and answered items 1 to 3. The ports that are down can be done at any time. Part B can be done in business hours (no user impact) (the DHCP exclusion is confirmed) once the SRX access decision is made.</w:t>
       </w:r>
     </w:p>
     <w:p>

</xml_diff>

<commit_message>
Port clean-up: apply Trinity answers of 22 Oct
Items 1 (three 20:7B:D2 ports to 2100) and 2 (switch-200V-8 UPS cards to
2000) moved into the main blocks; LT2-2 1/1/1 still pending. NTP check
complete.

Co-Authored-By: Claude Opus 5.5 <noreply@anthropic.com>
Claude-Session: https://claude.ai/code/session_01BZ7jJsE6GWKm6ehHY39VNr
</commit_message>
<xml_diff>
--- a/Trinity 200V Port Clean-up Change.docx
+++ b/Trinity 200V Port Clean-up Change.docx
@@ -22,7 +22,7 @@
     </w:p>
     <w:p>
       <w:r>
-        <w:t xml:space="preserve">Part A, port clean-up. Clean up 267 access ports on eight 200V switches as recommended by Trinity in column Q of Trinity_switch_ports_16-10-2026.xlsx (SmartZone export, 16 October 2026). Ports still on the old staff VLAN 1240 move to VL-staff-wired-01 (2100); unused ports still on old VLANs (mostly the old AV VLAN 1230) are returned to the default VLAN (VLAN 1); and old trunk (tagged) VLANs are removed from access ports where Trinity asked. 260 ports are in this change now; 7 wait for Trinity's answers to the review email of 21 October (see Prerequisites).</w:t>
+        <w:t xml:space="preserve">Part A, port clean-up. Clean up 267 access ports on eight 200V switches as recommended by Trinity in column Q of Trinity_switch_ports_16-10-2026.xlsx (SmartZone export, 16 October 2026). Ports still on the old staff VLAN 1240 move to VL-staff-wired-01 (2100); unused ports still on old VLANs (mostly the old AV VLAN 1230) are returned to the default VLAN (VLAN 1); three UPS management cards move to VL-netmgmt-01 (2000); and old trunk (tagged) VLANs are removed from access ports where Trinity asked. Trinity's answers of 22 October to the review email are included. 266 ports are in this change now; 1 (LT2-2 1/1/1) waits for Trinity's answer (see Prerequisites).</w:t>
       </w:r>
     </w:p>
     <w:p>
@@ -50,11 +50,12 @@
         </w:tblCellMar>
       </w:tblPr>
       <w:tblGrid>
-        <w:gridCol w:w="3068"/>
+        <w:gridCol w:w="2707"/>
         <w:gridCol w:w="1083"/>
+        <w:gridCol w:w="1353"/>
         <w:gridCol w:w="1083"/>
-        <w:gridCol w:w="1083"/>
-        <w:gridCol w:w="2709"/>
+        <w:gridCol w:w="1173"/>
+        <w:gridCol w:w="1627"/>
       </w:tblGrid>
       <w:tr>
         <w:trPr>
@@ -63,7 +64,7 @@
         </w:trPr>
         <w:tc>
           <w:tcPr>
-            <w:tcW w:w="3068" w:type="dxa"/>
+            <w:tcW w:w="2707" w:type="dxa"/>
             <w:shd w:val="clear" w:color="auto" w:fill="D9D9D9"/>
           </w:tcPr>
           <w:p>
@@ -74,8 +75,8 @@
               <w:rPr>
                 <w:b/>
                 <w:bCs/>
-                <w:sz w:val="20"/>
-                <w:szCs w:val="20"/>
+                <w:sz w:val="16"/>
+                <w:szCs w:val="16"/>
               </w:rPr>
               <w:t xml:space="preserve">Switch</w:t>
             </w:r>
@@ -94,10 +95,30 @@
               <w:rPr>
                 <w:b/>
                 <w:bCs/>
-                <w:sz w:val="20"/>
-                <w:szCs w:val="20"/>
+                <w:sz w:val="16"/>
+                <w:szCs w:val="16"/>
               </w:rPr>
               <w:t xml:space="preserve">To 2100</w:t>
+            </w:r>
+          </w:p>
+        </w:tc>
+        <w:tc>
+          <w:tcPr>
+            <w:tcW w:w="1353" w:type="dxa"/>
+            <w:shd w:val="clear" w:color="auto" w:fill="D9D9D9"/>
+          </w:tcPr>
+          <w:p>
+            <w:pPr>
+              <w:spacing w:after="0" w:line="240" w:lineRule="auto"/>
+            </w:pPr>
+            <w:r>
+              <w:rPr>
+                <w:b/>
+                <w:bCs/>
+                <w:sz w:val="16"/>
+                <w:szCs w:val="16"/>
+              </w:rPr>
+              <w:t xml:space="preserve">To 2100, tags off</w:t>
             </w:r>
           </w:p>
         </w:tc>
@@ -114,16 +135,16 @@
               <w:rPr>
                 <w:b/>
                 <w:bCs/>
-                <w:sz w:val="20"/>
-                <w:szCs w:val="20"/>
-              </w:rPr>
-              <w:t xml:space="preserve">To 2100, tags off</w:t>
-            </w:r>
-          </w:p>
-        </w:tc>
-        <w:tc>
-          <w:tcPr>
-            <w:tcW w:w="1083" w:type="dxa"/>
+                <w:sz w:val="16"/>
+                <w:szCs w:val="16"/>
+              </w:rPr>
+              <w:t xml:space="preserve">To 2000</w:t>
+            </w:r>
+          </w:p>
+        </w:tc>
+        <w:tc>
+          <w:tcPr>
+            <w:tcW w:w="1173" w:type="dxa"/>
             <w:shd w:val="clear" w:color="auto" w:fill="D9D9D9"/>
           </w:tcPr>
           <w:p>
@@ -134,8 +155,8 @@
               <w:rPr>
                 <w:b/>
                 <w:bCs/>
-                <w:sz w:val="20"/>
-                <w:szCs w:val="20"/>
+                <w:sz w:val="16"/>
+                <w:szCs w:val="16"/>
               </w:rPr>
               <w:t xml:space="preserve">To VLAN 1</w:t>
             </w:r>
@@ -143,7 +164,7 @@
         </w:tc>
         <w:tc>
           <w:tcPr>
-            <w:tcW w:w="2709" w:type="dxa"/>
+            <w:tcW w:w="1627" w:type="dxa"/>
             <w:shd w:val="clear" w:color="auto" w:fill="D9D9D9"/>
           </w:tcPr>
           <w:p>
@@ -154,8 +175,8 @@
               <w:rPr>
                 <w:b/>
                 <w:bCs/>
-                <w:sz w:val="20"/>
-                <w:szCs w:val="20"/>
+                <w:sz w:val="16"/>
+                <w:szCs w:val="16"/>
               </w:rPr>
               <w:t xml:space="preserve">To VLAN 1, tags off</w:t>
             </w:r>
@@ -168,16 +189,16 @@
         </w:trPr>
         <w:tc>
           <w:tcPr>
-            <w:tcW w:w="3068" w:type="dxa"/>
-          </w:tcPr>
-          <w:p>
-            <w:pPr>
-              <w:spacing w:after="0" w:line="240" w:lineRule="auto"/>
-            </w:pPr>
-            <w:r>
-              <w:rPr>
-                <w:sz w:val="20"/>
-                <w:szCs w:val="20"/>
+            <w:tcW w:w="2707" w:type="dxa"/>
+          </w:tcPr>
+          <w:p>
+            <w:pPr>
+              <w:spacing w:after="0" w:line="240" w:lineRule="auto"/>
+            </w:pPr>
+            <w:r>
+              <w:rPr>
+                <w:sz w:val="16"/>
+                <w:szCs w:val="16"/>
               </w:rPr>
               <w:t xml:space="preserve">switch-200V-stack-lv3</w:t>
             </w:r>
@@ -193,8 +214,59 @@
             </w:pPr>
             <w:r>
               <w:rPr>
-                <w:sz w:val="20"/>
-                <w:szCs w:val="20"/>
+                <w:sz w:val="16"/>
+                <w:szCs w:val="16"/>
+              </w:rPr>
+              <w:t xml:space="preserve">16</w:t>
+            </w:r>
+          </w:p>
+        </w:tc>
+        <w:tc>
+          <w:tcPr>
+            <w:tcW w:w="1353" w:type="dxa"/>
+          </w:tcPr>
+          <w:p>
+            <w:pPr>
+              <w:spacing w:after="0" w:line="240" w:lineRule="auto"/>
+            </w:pPr>
+            <w:r>
+              <w:rPr>
+                <w:sz w:val="16"/>
+                <w:szCs w:val="16"/>
+              </w:rPr>
+              <w:t xml:space="preserve">0</w:t>
+            </w:r>
+          </w:p>
+        </w:tc>
+        <w:tc>
+          <w:tcPr>
+            <w:tcW w:w="1083" w:type="dxa"/>
+          </w:tcPr>
+          <w:p>
+            <w:pPr>
+              <w:spacing w:after="0" w:line="240" w:lineRule="auto"/>
+            </w:pPr>
+            <w:r>
+              <w:rPr>
+                <w:sz w:val="16"/>
+                <w:szCs w:val="16"/>
+              </w:rPr>
+              <w:t xml:space="preserve">0</w:t>
+            </w:r>
+          </w:p>
+        </w:tc>
+        <w:tc>
+          <w:tcPr>
+            <w:tcW w:w="1173" w:type="dxa"/>
+          </w:tcPr>
+          <w:p>
+            <w:pPr>
+              <w:spacing w:after="0" w:line="240" w:lineRule="auto"/>
+            </w:pPr>
+            <w:r>
+              <w:rPr>
+                <w:sz w:val="16"/>
+                <w:szCs w:val="16"/>
               </w:rPr>
               <w:t xml:space="preserve">15</w:t>
             </w:r>
@@ -202,6 +274,45 @@
         </w:tc>
         <w:tc>
           <w:tcPr>
+            <w:tcW w:w="1627" w:type="dxa"/>
+          </w:tcPr>
+          <w:p>
+            <w:pPr>
+              <w:spacing w:after="0" w:line="240" w:lineRule="auto"/>
+            </w:pPr>
+            <w:r>
+              <w:rPr>
+                <w:sz w:val="16"/>
+                <w:szCs w:val="16"/>
+              </w:rPr>
+              <w:t xml:space="preserve">1</w:t>
+            </w:r>
+          </w:p>
+        </w:tc>
+      </w:tr>
+      <w:tr>
+        <w:trPr>
+          <w:cantSplit/>
+        </w:trPr>
+        <w:tc>
+          <w:tcPr>
+            <w:tcW w:w="2707" w:type="dxa"/>
+          </w:tcPr>
+          <w:p>
+            <w:pPr>
+              <w:spacing w:after="0" w:line="240" w:lineRule="auto"/>
+            </w:pPr>
+            <w:r>
+              <w:rPr>
+                <w:sz w:val="16"/>
+                <w:szCs w:val="16"/>
+              </w:rPr>
+              <w:t xml:space="preserve">switch-200V-stack-lv4</w:t>
+            </w:r>
+          </w:p>
+        </w:tc>
+        <w:tc>
+          <w:tcPr>
             <w:tcW w:w="1083" w:type="dxa"/>
           </w:tcPr>
           <w:p>
@@ -210,8 +321,25 @@
             </w:pPr>
             <w:r>
               <w:rPr>
-                <w:sz w:val="20"/>
-                <w:szCs w:val="20"/>
+                <w:sz w:val="16"/>
+                <w:szCs w:val="16"/>
+              </w:rPr>
+              <w:t xml:space="preserve">23</w:t>
+            </w:r>
+          </w:p>
+        </w:tc>
+        <w:tc>
+          <w:tcPr>
+            <w:tcW w:w="1353" w:type="dxa"/>
+          </w:tcPr>
+          <w:p>
+            <w:pPr>
+              <w:spacing w:after="0" w:line="240" w:lineRule="auto"/>
+            </w:pPr>
+            <w:r>
+              <w:rPr>
+                <w:sz w:val="16"/>
+                <w:szCs w:val="16"/>
               </w:rPr>
               <w:t xml:space="preserve">0</w:t>
             </w:r>
@@ -227,25 +355,42 @@
             </w:pPr>
             <w:r>
               <w:rPr>
-                <w:sz w:val="20"/>
-                <w:szCs w:val="20"/>
-              </w:rPr>
-              <w:t xml:space="preserve">15</w:t>
-            </w:r>
-          </w:p>
-        </w:tc>
-        <w:tc>
-          <w:tcPr>
-            <w:tcW w:w="2709" w:type="dxa"/>
-          </w:tcPr>
-          <w:p>
-            <w:pPr>
-              <w:spacing w:after="0" w:line="240" w:lineRule="auto"/>
-            </w:pPr>
-            <w:r>
-              <w:rPr>
-                <w:sz w:val="20"/>
-                <w:szCs w:val="20"/>
+                <w:sz w:val="16"/>
+                <w:szCs w:val="16"/>
+              </w:rPr>
+              <w:t xml:space="preserve">0</w:t>
+            </w:r>
+          </w:p>
+        </w:tc>
+        <w:tc>
+          <w:tcPr>
+            <w:tcW w:w="1173" w:type="dxa"/>
+          </w:tcPr>
+          <w:p>
+            <w:pPr>
+              <w:spacing w:after="0" w:line="240" w:lineRule="auto"/>
+            </w:pPr>
+            <w:r>
+              <w:rPr>
+                <w:sz w:val="16"/>
+                <w:szCs w:val="16"/>
+              </w:rPr>
+              <w:t xml:space="preserve">30</w:t>
+            </w:r>
+          </w:p>
+        </w:tc>
+        <w:tc>
+          <w:tcPr>
+            <w:tcW w:w="1627" w:type="dxa"/>
+          </w:tcPr>
+          <w:p>
+            <w:pPr>
+              <w:spacing w:after="0" w:line="240" w:lineRule="auto"/>
+            </w:pPr>
+            <w:r>
+              <w:rPr>
+                <w:sz w:val="16"/>
+                <w:szCs w:val="16"/>
               </w:rPr>
               <w:t xml:space="preserve">1</w:t>
             </w:r>
@@ -258,18 +403,18 @@
         </w:trPr>
         <w:tc>
           <w:tcPr>
-            <w:tcW w:w="3068" w:type="dxa"/>
-          </w:tcPr>
-          <w:p>
-            <w:pPr>
-              <w:spacing w:after="0" w:line="240" w:lineRule="auto"/>
-            </w:pPr>
-            <w:r>
-              <w:rPr>
-                <w:sz w:val="20"/>
-                <w:szCs w:val="20"/>
-              </w:rPr>
-              <w:t xml:space="preserve">switch-200V-stack-lv4</w:t>
+            <w:tcW w:w="2707" w:type="dxa"/>
+          </w:tcPr>
+          <w:p>
+            <w:pPr>
+              <w:spacing w:after="0" w:line="240" w:lineRule="auto"/>
+            </w:pPr>
+            <w:r>
+              <w:rPr>
+                <w:sz w:val="16"/>
+                <w:szCs w:val="16"/>
+              </w:rPr>
+              <w:t xml:space="preserve">switch-200V-stack-lv6</w:t>
             </w:r>
           </w:p>
         </w:tc>
@@ -283,10 +428,27 @@
             </w:pPr>
             <w:r>
               <w:rPr>
-                <w:sz w:val="20"/>
-                <w:szCs w:val="20"/>
-              </w:rPr>
-              <w:t xml:space="preserve">21</w:t>
+                <w:sz w:val="16"/>
+                <w:szCs w:val="16"/>
+              </w:rPr>
+              <w:t xml:space="preserve">116</w:t>
+            </w:r>
+          </w:p>
+        </w:tc>
+        <w:tc>
+          <w:tcPr>
+            <w:tcW w:w="1353" w:type="dxa"/>
+          </w:tcPr>
+          <w:p>
+            <w:pPr>
+              <w:spacing w:after="0" w:line="240" w:lineRule="auto"/>
+            </w:pPr>
+            <w:r>
+              <w:rPr>
+                <w:sz w:val="16"/>
+                <w:szCs w:val="16"/>
+              </w:rPr>
+              <w:t xml:space="preserve">19</w:t>
             </w:r>
           </w:p>
         </w:tc>
@@ -300,8 +462,8 @@
             </w:pPr>
             <w:r>
               <w:rPr>
-                <w:sz w:val="20"/>
-                <w:szCs w:val="20"/>
+                <w:sz w:val="16"/>
+                <w:szCs w:val="16"/>
               </w:rPr>
               <w:t xml:space="preserve">0</w:t>
             </w:r>
@@ -309,6 +471,62 @@
         </w:tc>
         <w:tc>
           <w:tcPr>
+            <w:tcW w:w="1173" w:type="dxa"/>
+          </w:tcPr>
+          <w:p>
+            <w:pPr>
+              <w:spacing w:after="0" w:line="240" w:lineRule="auto"/>
+            </w:pPr>
+            <w:r>
+              <w:rPr>
+                <w:sz w:val="16"/>
+                <w:szCs w:val="16"/>
+              </w:rPr>
+              <w:t xml:space="preserve">7</w:t>
+            </w:r>
+          </w:p>
+        </w:tc>
+        <w:tc>
+          <w:tcPr>
+            <w:tcW w:w="1627" w:type="dxa"/>
+          </w:tcPr>
+          <w:p>
+            <w:pPr>
+              <w:spacing w:after="0" w:line="240" w:lineRule="auto"/>
+            </w:pPr>
+            <w:r>
+              <w:rPr>
+                <w:sz w:val="16"/>
+                <w:szCs w:val="16"/>
+              </w:rPr>
+              <w:t xml:space="preserve">2</w:t>
+            </w:r>
+          </w:p>
+        </w:tc>
+      </w:tr>
+      <w:tr>
+        <w:trPr>
+          <w:cantSplit/>
+        </w:trPr>
+        <w:tc>
+          <w:tcPr>
+            <w:tcW w:w="2707" w:type="dxa"/>
+          </w:tcPr>
+          <w:p>
+            <w:pPr>
+              <w:spacing w:after="0" w:line="240" w:lineRule="auto"/>
+            </w:pPr>
+            <w:r>
+              <w:rPr>
+                <w:sz w:val="16"/>
+                <w:szCs w:val="16"/>
+              </w:rPr>
+              <w:t xml:space="preserve">switch-200V-LT2-1</w:t>
+            </w:r>
+          </w:p>
+        </w:tc>
+        <w:tc>
+          <w:tcPr>
             <w:tcW w:w="1083" w:type="dxa"/>
           </w:tcPr>
           <w:p>
@@ -317,49 +535,27 @@
             </w:pPr>
             <w:r>
               <w:rPr>
-                <w:sz w:val="20"/>
-                <w:szCs w:val="20"/>
-              </w:rPr>
-              <w:t xml:space="preserve">30</w:t>
-            </w:r>
-          </w:p>
-        </w:tc>
-        <w:tc>
-          <w:tcPr>
-            <w:tcW w:w="2709" w:type="dxa"/>
-          </w:tcPr>
-          <w:p>
-            <w:pPr>
-              <w:spacing w:after="0" w:line="240" w:lineRule="auto"/>
-            </w:pPr>
-            <w:r>
-              <w:rPr>
-                <w:sz w:val="20"/>
-                <w:szCs w:val="20"/>
+                <w:sz w:val="16"/>
+                <w:szCs w:val="16"/>
               </w:rPr>
               <w:t xml:space="preserve">1</w:t>
             </w:r>
           </w:p>
         </w:tc>
-      </w:tr>
-      <w:tr>
-        <w:trPr>
-          <w:cantSplit/>
-        </w:trPr>
-        <w:tc>
-          <w:tcPr>
-            <w:tcW w:w="3068" w:type="dxa"/>
-          </w:tcPr>
-          <w:p>
-            <w:pPr>
-              <w:spacing w:after="0" w:line="240" w:lineRule="auto"/>
-            </w:pPr>
-            <w:r>
-              <w:rPr>
-                <w:sz w:val="20"/>
-                <w:szCs w:val="20"/>
-              </w:rPr>
-              <w:t xml:space="preserve">switch-200V-stack-lv6</w:t>
+        <w:tc>
+          <w:tcPr>
+            <w:tcW w:w="1353" w:type="dxa"/>
+          </w:tcPr>
+          <w:p>
+            <w:pPr>
+              <w:spacing w:after="0" w:line="240" w:lineRule="auto"/>
+            </w:pPr>
+            <w:r>
+              <w:rPr>
+                <w:sz w:val="16"/>
+                <w:szCs w:val="16"/>
+              </w:rPr>
+              <w:t xml:space="preserve">0</w:t>
             </w:r>
           </w:p>
         </w:tc>
@@ -373,10 +569,66 @@
             </w:pPr>
             <w:r>
               <w:rPr>
-                <w:sz w:val="20"/>
-                <w:szCs w:val="20"/>
-              </w:rPr>
-              <w:t xml:space="preserve">116</w:t>
+                <w:sz w:val="16"/>
+                <w:szCs w:val="16"/>
+              </w:rPr>
+              <w:t xml:space="preserve">0</w:t>
+            </w:r>
+          </w:p>
+        </w:tc>
+        <w:tc>
+          <w:tcPr>
+            <w:tcW w:w="1173" w:type="dxa"/>
+          </w:tcPr>
+          <w:p>
+            <w:pPr>
+              <w:spacing w:after="0" w:line="240" w:lineRule="auto"/>
+            </w:pPr>
+            <w:r>
+              <w:rPr>
+                <w:sz w:val="16"/>
+                <w:szCs w:val="16"/>
+              </w:rPr>
+              <w:t xml:space="preserve">3</w:t>
+            </w:r>
+          </w:p>
+        </w:tc>
+        <w:tc>
+          <w:tcPr>
+            <w:tcW w:w="1627" w:type="dxa"/>
+          </w:tcPr>
+          <w:p>
+            <w:pPr>
+              <w:spacing w:after="0" w:line="240" w:lineRule="auto"/>
+            </w:pPr>
+            <w:r>
+              <w:rPr>
+                <w:sz w:val="16"/>
+                <w:szCs w:val="16"/>
+              </w:rPr>
+              <w:t xml:space="preserve">1</w:t>
+            </w:r>
+          </w:p>
+        </w:tc>
+      </w:tr>
+      <w:tr>
+        <w:trPr>
+          <w:cantSplit/>
+        </w:trPr>
+        <w:tc>
+          <w:tcPr>
+            <w:tcW w:w="2707" w:type="dxa"/>
+          </w:tcPr>
+          <w:p>
+            <w:pPr>
+              <w:spacing w:after="0" w:line="240" w:lineRule="auto"/>
+            </w:pPr>
+            <w:r>
+              <w:rPr>
+                <w:sz w:val="16"/>
+                <w:szCs w:val="16"/>
+              </w:rPr>
+              <w:t xml:space="preserve">switch-200V-LT2-2</w:t>
             </w:r>
           </w:p>
         </w:tc>
@@ -390,10 +642,27 @@
             </w:pPr>
             <w:r>
               <w:rPr>
-                <w:sz w:val="20"/>
-                <w:szCs w:val="20"/>
-              </w:rPr>
-              <w:t xml:space="preserve">19</w:t>
+                <w:sz w:val="16"/>
+                <w:szCs w:val="16"/>
+              </w:rPr>
+              <w:t xml:space="preserve">10</w:t>
+            </w:r>
+          </w:p>
+        </w:tc>
+        <w:tc>
+          <w:tcPr>
+            <w:tcW w:w="1353" w:type="dxa"/>
+          </w:tcPr>
+          <w:p>
+            <w:pPr>
+              <w:spacing w:after="0" w:line="240" w:lineRule="auto"/>
+            </w:pPr>
+            <w:r>
+              <w:rPr>
+                <w:sz w:val="16"/>
+                <w:szCs w:val="16"/>
+              </w:rPr>
+              <w:t xml:space="preserve">0</w:t>
             </w:r>
           </w:p>
         </w:tc>
@@ -407,8 +676,295 @@
             </w:pPr>
             <w:r>
               <w:rPr>
-                <w:sz w:val="20"/>
-                <w:szCs w:val="20"/>
+                <w:sz w:val="16"/>
+                <w:szCs w:val="16"/>
+              </w:rPr>
+              <w:t xml:space="preserve">0</w:t>
+            </w:r>
+          </w:p>
+        </w:tc>
+        <w:tc>
+          <w:tcPr>
+            <w:tcW w:w="1173" w:type="dxa"/>
+          </w:tcPr>
+          <w:p>
+            <w:pPr>
+              <w:spacing w:after="0" w:line="240" w:lineRule="auto"/>
+            </w:pPr>
+            <w:r>
+              <w:rPr>
+                <w:sz w:val="16"/>
+                <w:szCs w:val="16"/>
+              </w:rPr>
+              <w:t xml:space="preserve">0</w:t>
+            </w:r>
+          </w:p>
+        </w:tc>
+        <w:tc>
+          <w:tcPr>
+            <w:tcW w:w="1627" w:type="dxa"/>
+          </w:tcPr>
+          <w:p>
+            <w:pPr>
+              <w:spacing w:after="0" w:line="240" w:lineRule="auto"/>
+            </w:pPr>
+            <w:r>
+              <w:rPr>
+                <w:sz w:val="16"/>
+                <w:szCs w:val="16"/>
+              </w:rPr>
+              <w:t xml:space="preserve">0</w:t>
+            </w:r>
+          </w:p>
+        </w:tc>
+      </w:tr>
+      <w:tr>
+        <w:trPr>
+          <w:cantSplit/>
+        </w:trPr>
+        <w:tc>
+          <w:tcPr>
+            <w:tcW w:w="2707" w:type="dxa"/>
+          </w:tcPr>
+          <w:p>
+            <w:pPr>
+              <w:spacing w:after="0" w:line="240" w:lineRule="auto"/>
+            </w:pPr>
+            <w:r>
+              <w:rPr>
+                <w:sz w:val="16"/>
+                <w:szCs w:val="16"/>
+              </w:rPr>
+              <w:t xml:space="preserve">switch-200V-LT2-3</w:t>
+            </w:r>
+          </w:p>
+        </w:tc>
+        <w:tc>
+          <w:tcPr>
+            <w:tcW w:w="1083" w:type="dxa"/>
+          </w:tcPr>
+          <w:p>
+            <w:pPr>
+              <w:spacing w:after="0" w:line="240" w:lineRule="auto"/>
+            </w:pPr>
+            <w:r>
+              <w:rPr>
+                <w:sz w:val="16"/>
+                <w:szCs w:val="16"/>
+              </w:rPr>
+              <w:t xml:space="preserve">0</w:t>
+            </w:r>
+          </w:p>
+        </w:tc>
+        <w:tc>
+          <w:tcPr>
+            <w:tcW w:w="1353" w:type="dxa"/>
+          </w:tcPr>
+          <w:p>
+            <w:pPr>
+              <w:spacing w:after="0" w:line="240" w:lineRule="auto"/>
+            </w:pPr>
+            <w:r>
+              <w:rPr>
+                <w:sz w:val="16"/>
+                <w:szCs w:val="16"/>
+              </w:rPr>
+              <w:t xml:space="preserve">10</w:t>
+            </w:r>
+          </w:p>
+        </w:tc>
+        <w:tc>
+          <w:tcPr>
+            <w:tcW w:w="1083" w:type="dxa"/>
+          </w:tcPr>
+          <w:p>
+            <w:pPr>
+              <w:spacing w:after="0" w:line="240" w:lineRule="auto"/>
+            </w:pPr>
+            <w:r>
+              <w:rPr>
+                <w:sz w:val="16"/>
+                <w:szCs w:val="16"/>
+              </w:rPr>
+              <w:t xml:space="preserve">0</w:t>
+            </w:r>
+          </w:p>
+        </w:tc>
+        <w:tc>
+          <w:tcPr>
+            <w:tcW w:w="1173" w:type="dxa"/>
+          </w:tcPr>
+          <w:p>
+            <w:pPr>
+              <w:spacing w:after="0" w:line="240" w:lineRule="auto"/>
+            </w:pPr>
+            <w:r>
+              <w:rPr>
+                <w:sz w:val="16"/>
+                <w:szCs w:val="16"/>
+              </w:rPr>
+              <w:t xml:space="preserve">0</w:t>
+            </w:r>
+          </w:p>
+        </w:tc>
+        <w:tc>
+          <w:tcPr>
+            <w:tcW w:w="1627" w:type="dxa"/>
+          </w:tcPr>
+          <w:p>
+            <w:pPr>
+              <w:spacing w:after="0" w:line="240" w:lineRule="auto"/>
+            </w:pPr>
+            <w:r>
+              <w:rPr>
+                <w:sz w:val="16"/>
+                <w:szCs w:val="16"/>
+              </w:rPr>
+              <w:t xml:space="preserve">0</w:t>
+            </w:r>
+          </w:p>
+        </w:tc>
+      </w:tr>
+      <w:tr>
+        <w:trPr>
+          <w:cantSplit/>
+        </w:trPr>
+        <w:tc>
+          <w:tcPr>
+            <w:tcW w:w="2707" w:type="dxa"/>
+          </w:tcPr>
+          <w:p>
+            <w:pPr>
+              <w:spacing w:after="0" w:line="240" w:lineRule="auto"/>
+            </w:pPr>
+            <w:r>
+              <w:rPr>
+                <w:sz w:val="16"/>
+                <w:szCs w:val="16"/>
+              </w:rPr>
+              <w:t xml:space="preserve">switch-200V-Tutorial-6.03</w:t>
+            </w:r>
+          </w:p>
+        </w:tc>
+        <w:tc>
+          <w:tcPr>
+            <w:tcW w:w="1083" w:type="dxa"/>
+          </w:tcPr>
+          <w:p>
+            <w:pPr>
+              <w:spacing w:after="0" w:line="240" w:lineRule="auto"/>
+            </w:pPr>
+            <w:r>
+              <w:rPr>
+                <w:sz w:val="16"/>
+                <w:szCs w:val="16"/>
+              </w:rPr>
+              <w:t xml:space="preserve">0</w:t>
+            </w:r>
+          </w:p>
+        </w:tc>
+        <w:tc>
+          <w:tcPr>
+            <w:tcW w:w="1353" w:type="dxa"/>
+          </w:tcPr>
+          <w:p>
+            <w:pPr>
+              <w:spacing w:after="0" w:line="240" w:lineRule="auto"/>
+            </w:pPr>
+            <w:r>
+              <w:rPr>
+                <w:sz w:val="16"/>
+                <w:szCs w:val="16"/>
+              </w:rPr>
+              <w:t xml:space="preserve">0</w:t>
+            </w:r>
+          </w:p>
+        </w:tc>
+        <w:tc>
+          <w:tcPr>
+            <w:tcW w:w="1083" w:type="dxa"/>
+          </w:tcPr>
+          <w:p>
+            <w:pPr>
+              <w:spacing w:after="0" w:line="240" w:lineRule="auto"/>
+            </w:pPr>
+            <w:r>
+              <w:rPr>
+                <w:sz w:val="16"/>
+                <w:szCs w:val="16"/>
+              </w:rPr>
+              <w:t xml:space="preserve">0</w:t>
+            </w:r>
+          </w:p>
+        </w:tc>
+        <w:tc>
+          <w:tcPr>
+            <w:tcW w:w="1173" w:type="dxa"/>
+          </w:tcPr>
+          <w:p>
+            <w:pPr>
+              <w:spacing w:after="0" w:line="240" w:lineRule="auto"/>
+            </w:pPr>
+            <w:r>
+              <w:rPr>
+                <w:sz w:val="16"/>
+                <w:szCs w:val="16"/>
+              </w:rPr>
+              <w:t xml:space="preserve">1</w:t>
+            </w:r>
+          </w:p>
+        </w:tc>
+        <w:tc>
+          <w:tcPr>
+            <w:tcW w:w="1627" w:type="dxa"/>
+          </w:tcPr>
+          <w:p>
+            <w:pPr>
+              <w:spacing w:after="0" w:line="240" w:lineRule="auto"/>
+            </w:pPr>
+            <w:r>
+              <w:rPr>
+                <w:sz w:val="16"/>
+                <w:szCs w:val="16"/>
+              </w:rPr>
+              <w:t xml:space="preserve">0</w:t>
+            </w:r>
+          </w:p>
+        </w:tc>
+      </w:tr>
+      <w:tr>
+        <w:trPr>
+          <w:cantSplit/>
+        </w:trPr>
+        <w:tc>
+          <w:tcPr>
+            <w:tcW w:w="2707" w:type="dxa"/>
+          </w:tcPr>
+          <w:p>
+            <w:pPr>
+              <w:spacing w:after="0" w:line="240" w:lineRule="auto"/>
+            </w:pPr>
+            <w:r>
+              <w:rPr>
+                <w:sz w:val="16"/>
+                <w:szCs w:val="16"/>
+              </w:rPr>
+              <w:t xml:space="preserve">switch-200V-8</w:t>
+            </w:r>
+          </w:p>
+        </w:tc>
+        <w:tc>
+          <w:tcPr>
+            <w:tcW w:w="1083" w:type="dxa"/>
+          </w:tcPr>
+          <w:p>
+            <w:pPr>
+              <w:spacing w:after="0" w:line="240" w:lineRule="auto"/>
+            </w:pPr>
+            <w:r>
+              <w:rPr>
+                <w:sz w:val="16"/>
+                <w:szCs w:val="16"/>
               </w:rPr>
               <w:t xml:space="preserve">7</w:t>
             </w:r>
@@ -416,40 +972,18 @@
         </w:tc>
         <w:tc>
           <w:tcPr>
-            <w:tcW w:w="2709" w:type="dxa"/>
-          </w:tcPr>
-          <w:p>
-            <w:pPr>
-              <w:spacing w:after="0" w:line="240" w:lineRule="auto"/>
-            </w:pPr>
-            <w:r>
-              <w:rPr>
-                <w:sz w:val="20"/>
-                <w:szCs w:val="20"/>
-              </w:rPr>
-              <w:t xml:space="preserve">2</w:t>
-            </w:r>
-          </w:p>
-        </w:tc>
-      </w:tr>
-      <w:tr>
-        <w:trPr>
-          <w:cantSplit/>
-        </w:trPr>
-        <w:tc>
-          <w:tcPr>
-            <w:tcW w:w="3068" w:type="dxa"/>
-          </w:tcPr>
-          <w:p>
-            <w:pPr>
-              <w:spacing w:after="0" w:line="240" w:lineRule="auto"/>
-            </w:pPr>
-            <w:r>
-              <w:rPr>
-                <w:sz w:val="20"/>
-                <w:szCs w:val="20"/>
-              </w:rPr>
-              <w:t xml:space="preserve">switch-200V-LT2-1</w:t>
+            <w:tcW w:w="1353" w:type="dxa"/>
+          </w:tcPr>
+          <w:p>
+            <w:pPr>
+              <w:spacing w:after="0" w:line="240" w:lineRule="auto"/>
+            </w:pPr>
+            <w:r>
+              <w:rPr>
+                <w:sz w:val="16"/>
+                <w:szCs w:val="16"/>
+              </w:rPr>
+              <w:t xml:space="preserve">0</w:t>
             </w:r>
           </w:p>
         </w:tc>
@@ -463,10 +997,66 @@
             </w:pPr>
             <w:r>
               <w:rPr>
-                <w:sz w:val="20"/>
-                <w:szCs w:val="20"/>
-              </w:rPr>
-              <w:t xml:space="preserve">1</w:t>
+                <w:sz w:val="16"/>
+                <w:szCs w:val="16"/>
+              </w:rPr>
+              <w:t xml:space="preserve">3</w:t>
+            </w:r>
+          </w:p>
+        </w:tc>
+        <w:tc>
+          <w:tcPr>
+            <w:tcW w:w="1173" w:type="dxa"/>
+          </w:tcPr>
+          <w:p>
+            <w:pPr>
+              <w:spacing w:after="0" w:line="240" w:lineRule="auto"/>
+            </w:pPr>
+            <w:r>
+              <w:rPr>
+                <w:sz w:val="16"/>
+                <w:szCs w:val="16"/>
+              </w:rPr>
+              <w:t xml:space="preserve">0</w:t>
+            </w:r>
+          </w:p>
+        </w:tc>
+        <w:tc>
+          <w:tcPr>
+            <w:tcW w:w="1627" w:type="dxa"/>
+          </w:tcPr>
+          <w:p>
+            <w:pPr>
+              <w:spacing w:after="0" w:line="240" w:lineRule="auto"/>
+            </w:pPr>
+            <w:r>
+              <w:rPr>
+                <w:sz w:val="16"/>
+                <w:szCs w:val="16"/>
+              </w:rPr>
+              <w:t xml:space="preserve">0</w:t>
+            </w:r>
+          </w:p>
+        </w:tc>
+      </w:tr>
+      <w:tr>
+        <w:trPr>
+          <w:cantSplit/>
+        </w:trPr>
+        <w:tc>
+          <w:tcPr>
+            <w:tcW w:w="2707" w:type="dxa"/>
+          </w:tcPr>
+          <w:p>
+            <w:pPr>
+              <w:spacing w:after="0" w:line="240" w:lineRule="auto"/>
+            </w:pPr>
+            <w:r>
+              <w:rPr>
+                <w:sz w:val="16"/>
+                <w:szCs w:val="16"/>
+              </w:rPr>
+              <w:t xml:space="preserve">Total</w:t>
             </w:r>
           </w:p>
         </w:tc>
@@ -480,10 +1070,27 @@
             </w:pPr>
             <w:r>
               <w:rPr>
-                <w:sz w:val="20"/>
-                <w:szCs w:val="20"/>
-              </w:rPr>
-              <w:t xml:space="preserve">0</w:t>
+                <w:sz w:val="16"/>
+                <w:szCs w:val="16"/>
+              </w:rPr>
+              <w:t xml:space="preserve">173</w:t>
+            </w:r>
+          </w:p>
+        </w:tc>
+        <w:tc>
+          <w:tcPr>
+            <w:tcW w:w="1353" w:type="dxa"/>
+          </w:tcPr>
+          <w:p>
+            <w:pPr>
+              <w:spacing w:after="0" w:line="240" w:lineRule="auto"/>
+            </w:pPr>
+            <w:r>
+              <w:rPr>
+                <w:sz w:val="16"/>
+                <w:szCs w:val="16"/>
+              </w:rPr>
+              <w:t xml:space="preserve">29</w:t>
             </w:r>
           </w:p>
         </w:tc>
@@ -497,8 +1104,8 @@
             </w:pPr>
             <w:r>
               <w:rPr>
-                <w:sz w:val="20"/>
-                <w:szCs w:val="20"/>
+                <w:sz w:val="16"/>
+                <w:szCs w:val="16"/>
               </w:rPr>
               <w:t xml:space="preserve">3</w:t>
             </w:r>
@@ -506,449 +1113,16 @@
         </w:tc>
         <w:tc>
           <w:tcPr>
-            <w:tcW w:w="2709" w:type="dxa"/>
-          </w:tcPr>
-          <w:p>
-            <w:pPr>
-              <w:spacing w:after="0" w:line="240" w:lineRule="auto"/>
-            </w:pPr>
-            <w:r>
-              <w:rPr>
-                <w:sz w:val="20"/>
-                <w:szCs w:val="20"/>
-              </w:rPr>
-              <w:t xml:space="preserve">1</w:t>
-            </w:r>
-          </w:p>
-        </w:tc>
-      </w:tr>
-      <w:tr>
-        <w:trPr>
-          <w:cantSplit/>
-        </w:trPr>
-        <w:tc>
-          <w:tcPr>
-            <w:tcW w:w="3068" w:type="dxa"/>
-          </w:tcPr>
-          <w:p>
-            <w:pPr>
-              <w:spacing w:after="0" w:line="240" w:lineRule="auto"/>
-            </w:pPr>
-            <w:r>
-              <w:rPr>
-                <w:sz w:val="20"/>
-                <w:szCs w:val="20"/>
-              </w:rPr>
-              <w:t xml:space="preserve">switch-200V-LT2-2</w:t>
-            </w:r>
-          </w:p>
-        </w:tc>
-        <w:tc>
-          <w:tcPr>
-            <w:tcW w:w="1083" w:type="dxa"/>
-          </w:tcPr>
-          <w:p>
-            <w:pPr>
-              <w:spacing w:after="0" w:line="240" w:lineRule="auto"/>
-            </w:pPr>
-            <w:r>
-              <w:rPr>
-                <w:sz w:val="20"/>
-                <w:szCs w:val="20"/>
-              </w:rPr>
-              <w:t xml:space="preserve">10</w:t>
-            </w:r>
-          </w:p>
-        </w:tc>
-        <w:tc>
-          <w:tcPr>
-            <w:tcW w:w="1083" w:type="dxa"/>
-          </w:tcPr>
-          <w:p>
-            <w:pPr>
-              <w:spacing w:after="0" w:line="240" w:lineRule="auto"/>
-            </w:pPr>
-            <w:r>
-              <w:rPr>
-                <w:sz w:val="20"/>
-                <w:szCs w:val="20"/>
-              </w:rPr>
-              <w:t xml:space="preserve">0</w:t>
-            </w:r>
-          </w:p>
-        </w:tc>
-        <w:tc>
-          <w:tcPr>
-            <w:tcW w:w="1083" w:type="dxa"/>
-          </w:tcPr>
-          <w:p>
-            <w:pPr>
-              <w:spacing w:after="0" w:line="240" w:lineRule="auto"/>
-            </w:pPr>
-            <w:r>
-              <w:rPr>
-                <w:sz w:val="20"/>
-                <w:szCs w:val="20"/>
-              </w:rPr>
-              <w:t xml:space="preserve">0</w:t>
-            </w:r>
-          </w:p>
-        </w:tc>
-        <w:tc>
-          <w:tcPr>
-            <w:tcW w:w="2709" w:type="dxa"/>
-          </w:tcPr>
-          <w:p>
-            <w:pPr>
-              <w:spacing w:after="0" w:line="240" w:lineRule="auto"/>
-            </w:pPr>
-            <w:r>
-              <w:rPr>
-                <w:sz w:val="20"/>
-                <w:szCs w:val="20"/>
-              </w:rPr>
-              <w:t xml:space="preserve">0</w:t>
-            </w:r>
-          </w:p>
-        </w:tc>
-      </w:tr>
-      <w:tr>
-        <w:trPr>
-          <w:cantSplit/>
-        </w:trPr>
-        <w:tc>
-          <w:tcPr>
-            <w:tcW w:w="3068" w:type="dxa"/>
-          </w:tcPr>
-          <w:p>
-            <w:pPr>
-              <w:spacing w:after="0" w:line="240" w:lineRule="auto"/>
-            </w:pPr>
-            <w:r>
-              <w:rPr>
-                <w:sz w:val="20"/>
-                <w:szCs w:val="20"/>
-              </w:rPr>
-              <w:t xml:space="preserve">switch-200V-LT2-3</w:t>
-            </w:r>
-          </w:p>
-        </w:tc>
-        <w:tc>
-          <w:tcPr>
-            <w:tcW w:w="1083" w:type="dxa"/>
-          </w:tcPr>
-          <w:p>
-            <w:pPr>
-              <w:spacing w:after="0" w:line="240" w:lineRule="auto"/>
-            </w:pPr>
-            <w:r>
-              <w:rPr>
-                <w:sz w:val="20"/>
-                <w:szCs w:val="20"/>
-              </w:rPr>
-              <w:t xml:space="preserve">0</w:t>
-            </w:r>
-          </w:p>
-        </w:tc>
-        <w:tc>
-          <w:tcPr>
-            <w:tcW w:w="1083" w:type="dxa"/>
-          </w:tcPr>
-          <w:p>
-            <w:pPr>
-              <w:spacing w:after="0" w:line="240" w:lineRule="auto"/>
-            </w:pPr>
-            <w:r>
-              <w:rPr>
-                <w:sz w:val="20"/>
-                <w:szCs w:val="20"/>
-              </w:rPr>
-              <w:t xml:space="preserve">10</w:t>
-            </w:r>
-          </w:p>
-        </w:tc>
-        <w:tc>
-          <w:tcPr>
-            <w:tcW w:w="1083" w:type="dxa"/>
-          </w:tcPr>
-          <w:p>
-            <w:pPr>
-              <w:spacing w:after="0" w:line="240" w:lineRule="auto"/>
-            </w:pPr>
-            <w:r>
-              <w:rPr>
-                <w:sz w:val="20"/>
-                <w:szCs w:val="20"/>
-              </w:rPr>
-              <w:t xml:space="preserve">0</w:t>
-            </w:r>
-          </w:p>
-        </w:tc>
-        <w:tc>
-          <w:tcPr>
-            <w:tcW w:w="2709" w:type="dxa"/>
-          </w:tcPr>
-          <w:p>
-            <w:pPr>
-              <w:spacing w:after="0" w:line="240" w:lineRule="auto"/>
-            </w:pPr>
-            <w:r>
-              <w:rPr>
-                <w:sz w:val="20"/>
-                <w:szCs w:val="20"/>
-              </w:rPr>
-              <w:t xml:space="preserve">0</w:t>
-            </w:r>
-          </w:p>
-        </w:tc>
-      </w:tr>
-      <w:tr>
-        <w:trPr>
-          <w:cantSplit/>
-        </w:trPr>
-        <w:tc>
-          <w:tcPr>
-            <w:tcW w:w="3068" w:type="dxa"/>
-          </w:tcPr>
-          <w:p>
-            <w:pPr>
-              <w:spacing w:after="0" w:line="240" w:lineRule="auto"/>
-            </w:pPr>
-            <w:r>
-              <w:rPr>
-                <w:sz w:val="20"/>
-                <w:szCs w:val="20"/>
-              </w:rPr>
-              <w:t xml:space="preserve">switch-200V-Tutorial-6.03</w:t>
-            </w:r>
-          </w:p>
-        </w:tc>
-        <w:tc>
-          <w:tcPr>
-            <w:tcW w:w="1083" w:type="dxa"/>
-          </w:tcPr>
-          <w:p>
-            <w:pPr>
-              <w:spacing w:after="0" w:line="240" w:lineRule="auto"/>
-            </w:pPr>
-            <w:r>
-              <w:rPr>
-                <w:sz w:val="20"/>
-                <w:szCs w:val="20"/>
-              </w:rPr>
-              <w:t xml:space="preserve">0</w:t>
-            </w:r>
-          </w:p>
-        </w:tc>
-        <w:tc>
-          <w:tcPr>
-            <w:tcW w:w="1083" w:type="dxa"/>
-          </w:tcPr>
-          <w:p>
-            <w:pPr>
-              <w:spacing w:after="0" w:line="240" w:lineRule="auto"/>
-            </w:pPr>
-            <w:r>
-              <w:rPr>
-                <w:sz w:val="20"/>
-                <w:szCs w:val="20"/>
-              </w:rPr>
-              <w:t xml:space="preserve">0</w:t>
-            </w:r>
-          </w:p>
-        </w:tc>
-        <w:tc>
-          <w:tcPr>
-            <w:tcW w:w="1083" w:type="dxa"/>
-          </w:tcPr>
-          <w:p>
-            <w:pPr>
-              <w:spacing w:after="0" w:line="240" w:lineRule="auto"/>
-            </w:pPr>
-            <w:r>
-              <w:rPr>
-                <w:sz w:val="20"/>
-                <w:szCs w:val="20"/>
-              </w:rPr>
-              <w:t xml:space="preserve">1</w:t>
-            </w:r>
-          </w:p>
-        </w:tc>
-        <w:tc>
-          <w:tcPr>
-            <w:tcW w:w="2709" w:type="dxa"/>
-          </w:tcPr>
-          <w:p>
-            <w:pPr>
-              <w:spacing w:after="0" w:line="240" w:lineRule="auto"/>
-            </w:pPr>
-            <w:r>
-              <w:rPr>
-                <w:sz w:val="20"/>
-                <w:szCs w:val="20"/>
-              </w:rPr>
-              <w:t xml:space="preserve">0</w:t>
-            </w:r>
-          </w:p>
-        </w:tc>
-      </w:tr>
-      <w:tr>
-        <w:trPr>
-          <w:cantSplit/>
-        </w:trPr>
-        <w:tc>
-          <w:tcPr>
-            <w:tcW w:w="3068" w:type="dxa"/>
-          </w:tcPr>
-          <w:p>
-            <w:pPr>
-              <w:spacing w:after="0" w:line="240" w:lineRule="auto"/>
-            </w:pPr>
-            <w:r>
-              <w:rPr>
-                <w:sz w:val="20"/>
-                <w:szCs w:val="20"/>
-              </w:rPr>
-              <w:t xml:space="preserve">switch-200V-8</w:t>
-            </w:r>
-          </w:p>
-        </w:tc>
-        <w:tc>
-          <w:tcPr>
-            <w:tcW w:w="1083" w:type="dxa"/>
-          </w:tcPr>
-          <w:p>
-            <w:pPr>
-              <w:spacing w:after="0" w:line="240" w:lineRule="auto"/>
-            </w:pPr>
-            <w:r>
-              <w:rPr>
-                <w:sz w:val="20"/>
-                <w:szCs w:val="20"/>
-              </w:rPr>
-              <w:t xml:space="preserve">7</w:t>
-            </w:r>
-          </w:p>
-        </w:tc>
-        <w:tc>
-          <w:tcPr>
-            <w:tcW w:w="1083" w:type="dxa"/>
-          </w:tcPr>
-          <w:p>
-            <w:pPr>
-              <w:spacing w:after="0" w:line="240" w:lineRule="auto"/>
-            </w:pPr>
-            <w:r>
-              <w:rPr>
-                <w:sz w:val="20"/>
-                <w:szCs w:val="20"/>
-              </w:rPr>
-              <w:t xml:space="preserve">0</w:t>
-            </w:r>
-          </w:p>
-        </w:tc>
-        <w:tc>
-          <w:tcPr>
-            <w:tcW w:w="1083" w:type="dxa"/>
-          </w:tcPr>
-          <w:p>
-            <w:pPr>
-              <w:spacing w:after="0" w:line="240" w:lineRule="auto"/>
-            </w:pPr>
-            <w:r>
-              <w:rPr>
-                <w:sz w:val="20"/>
-                <w:szCs w:val="20"/>
-              </w:rPr>
-              <w:t xml:space="preserve">0</w:t>
-            </w:r>
-          </w:p>
-        </w:tc>
-        <w:tc>
-          <w:tcPr>
-            <w:tcW w:w="2709" w:type="dxa"/>
-          </w:tcPr>
-          <w:p>
-            <w:pPr>
-              <w:spacing w:after="0" w:line="240" w:lineRule="auto"/>
-            </w:pPr>
-            <w:r>
-              <w:rPr>
-                <w:sz w:val="20"/>
-                <w:szCs w:val="20"/>
-              </w:rPr>
-              <w:t xml:space="preserve">0</w:t>
-            </w:r>
-          </w:p>
-        </w:tc>
-      </w:tr>
-      <w:tr>
-        <w:trPr>
-          <w:cantSplit/>
-        </w:trPr>
-        <w:tc>
-          <w:tcPr>
-            <w:tcW w:w="3068" w:type="dxa"/>
-          </w:tcPr>
-          <w:p>
-            <w:pPr>
-              <w:spacing w:after="0" w:line="240" w:lineRule="auto"/>
-            </w:pPr>
-            <w:r>
-              <w:rPr>
-                <w:sz w:val="20"/>
-                <w:szCs w:val="20"/>
-              </w:rPr>
-              <w:t xml:space="preserve">Total</w:t>
-            </w:r>
-          </w:p>
-        </w:tc>
-        <w:tc>
-          <w:tcPr>
-            <w:tcW w:w="1083" w:type="dxa"/>
-          </w:tcPr>
-          <w:p>
-            <w:pPr>
-              <w:spacing w:after="0" w:line="240" w:lineRule="auto"/>
-            </w:pPr>
-            <w:r>
-              <w:rPr>
-                <w:sz w:val="20"/>
-                <w:szCs w:val="20"/>
-              </w:rPr>
-              <w:t xml:space="preserve">170</w:t>
-            </w:r>
-          </w:p>
-        </w:tc>
-        <w:tc>
-          <w:tcPr>
-            <w:tcW w:w="1083" w:type="dxa"/>
-          </w:tcPr>
-          <w:p>
-            <w:pPr>
-              <w:spacing w:after="0" w:line="240" w:lineRule="auto"/>
-            </w:pPr>
-            <w:r>
-              <w:rPr>
-                <w:sz w:val="20"/>
-                <w:szCs w:val="20"/>
-              </w:rPr>
-              <w:t xml:space="preserve">29</w:t>
-            </w:r>
-          </w:p>
-        </w:tc>
-        <w:tc>
-          <w:tcPr>
-            <w:tcW w:w="1083" w:type="dxa"/>
-          </w:tcPr>
-          <w:p>
-            <w:pPr>
-              <w:spacing w:after="0" w:line="240" w:lineRule="auto"/>
-            </w:pPr>
-            <w:r>
-              <w:rPr>
-                <w:sz w:val="20"/>
-                <w:szCs w:val="20"/>
+            <w:tcW w:w="1173" w:type="dxa"/>
+          </w:tcPr>
+          <w:p>
+            <w:pPr>
+              <w:spacing w:after="0" w:line="240" w:lineRule="auto"/>
+            </w:pPr>
+            <w:r>
+              <w:rPr>
+                <w:sz w:val="16"/>
+                <w:szCs w:val="16"/>
               </w:rPr>
               <w:t xml:space="preserve">56</w:t>
             </w:r>
@@ -956,16 +1130,16 @@
         </w:tc>
         <w:tc>
           <w:tcPr>
-            <w:tcW w:w="2709" w:type="dxa"/>
-          </w:tcPr>
-          <w:p>
-            <w:pPr>
-              <w:spacing w:after="0" w:line="240" w:lineRule="auto"/>
-            </w:pPr>
-            <w:r>
-              <w:rPr>
-                <w:sz w:val="20"/>
-                <w:szCs w:val="20"/>
+            <w:tcW w:w="1627" w:type="dxa"/>
+          </w:tcPr>
+          <w:p>
+            <w:pPr>
+              <w:spacing w:after="0" w:line="240" w:lineRule="auto"/>
+            </w:pPr>
+            <w:r>
+              <w:rPr>
+                <w:sz w:val="16"/>
+                <w:szCs w:val="16"/>
               </w:rPr>
               <w:t xml:space="preserve">5</w:t>
             </w:r>
@@ -2012,7 +2186,7 @@
         <w:spacing w:after="60"/>
       </w:pPr>
       <w:r>
-        <w:t xml:space="preserve">238 of the 260 ports were down on 16 October: no impact; a device plugged in later comes up on the new VLAN</w:t>
+        <w:t xml:space="preserve">241 of the 266 ports were down on 16 October: no impact; a device plugged in later comes up on the new VLAN</w:t>
       </w:r>
     </w:p>
     <w:p>
@@ -2025,7 +2199,20 @@
         <w:spacing w:after="60"/>
       </w:pPr>
       <w:r>
-        <w:t xml:space="preserve">22 ports were up, with staff devices on 1240 (10.9.9.x). Each loses its connection for about 30 seconds while the port is bounced, then gets a new address on 10.21.3.0/24 (VL-staff-wired-01)</w:t>
+        <w:t xml:space="preserve">25 ports were up: staff devices on 1240 (10.9.9.x) and the three UPS cards on switch-200V-8. Each loses its connection for about 30 seconds while the port is bounced; staff devices then get a new address on 10.21.3.0/24 (VL-staff-wired-01)</w:t>
+      </w:r>
+    </w:p>
+    <w:p>
+      <w:pPr>
+        <w:pStyle w:val="ListParagraph"/>
+        <w:numPr>
+          <w:ilvl w:val="0"/>
+          <w:numId w:val="1"/>
+        </w:numPr>
+        <w:spacing w:after="60"/>
+      </w:pPr>
+      <w:r>
+        <w:t xml:space="preserve">The three UPS cards (switch-200V-8 1/1/7 - 1/1/9, 10.9.9.95 - .97) need DHCP or a fixed 10.21.0.x address (outside 10.21.0.20 - .27) before they are reachable on VL-netmgmt-01</w:t>
       </w:r>
     </w:p>
     <w:p>
@@ -2510,6 +2697,84 @@
                 <w:sz w:val="20"/>
                 <w:szCs w:val="20"/>
               </w:rPr>
+              <w:t xml:space="preserve">Complete (Trinity 22 October: 2100)</w:t>
+            </w:r>
+          </w:p>
+        </w:tc>
+      </w:tr>
+      <w:tr>
+        <w:trPr>
+          <w:cantSplit/>
+        </w:trPr>
+        <w:tc>
+          <w:tcPr>
+            <w:tcW w:w="7026" w:type="dxa"/>
+          </w:tcPr>
+          <w:p>
+            <w:pPr>
+              <w:spacing w:after="0" w:line="240" w:lineRule="auto"/>
+            </w:pPr>
+            <w:r>
+              <w:rPr>
+                <w:sz w:val="20"/>
+                <w:szCs w:val="20"/>
+              </w:rPr>
+              <w:t xml:space="preserve">Item 2: switch-200V-8 1/1/7 - 1/1/9 (00:09:F5, same vendor as lv3/lv4 1/1/48 now on 2000). Trinity to confirm the device type, VLAN 2000 or 2100, and whether they have fixed addresses</w:t>
+            </w:r>
+          </w:p>
+        </w:tc>
+        <w:tc>
+          <w:tcPr>
+            <w:tcW w:w="2000" w:type="dxa"/>
+          </w:tcPr>
+          <w:p>
+            <w:pPr>
+              <w:spacing w:after="0" w:line="240" w:lineRule="auto"/>
+            </w:pPr>
+            <w:r>
+              <w:rPr>
+                <w:sz w:val="20"/>
+                <w:szCs w:val="20"/>
+              </w:rPr>
+              <w:t xml:space="preserve">Complete (Trinity 22 October: UPS cards, 2000). Addressing of the cards on 10.21.0.0/24 still to be set</w:t>
+            </w:r>
+          </w:p>
+        </w:tc>
+      </w:tr>
+      <w:tr>
+        <w:trPr>
+          <w:cantSplit/>
+        </w:trPr>
+        <w:tc>
+          <w:tcPr>
+            <w:tcW w:w="7026" w:type="dxa"/>
+          </w:tcPr>
+          <w:p>
+            <w:pPr>
+              <w:spacing w:after="0" w:line="240" w:lineRule="auto"/>
+            </w:pPr>
+            <w:r>
+              <w:rPr>
+                <w:sz w:val="20"/>
+                <w:szCs w:val="20"/>
+              </w:rPr>
+              <w:t xml:space="preserve">Item 3: LT2-2 1/1/1 is not the LT2-2 uplink (that is 1/1/12); Trinity to confirm no switch is to be connected before its trunk VLANs are removed</w:t>
+            </w:r>
+          </w:p>
+        </w:tc>
+        <w:tc>
+          <w:tcPr>
+            <w:tcW w:w="2000" w:type="dxa"/>
+          </w:tcPr>
+          <w:p>
+            <w:pPr>
+              <w:spacing w:after="0" w:line="240" w:lineRule="auto"/>
+            </w:pPr>
+            <w:r>
+              <w:rPr>
+                <w:sz w:val="20"/>
+                <w:szCs w:val="20"/>
+              </w:rPr>
               <w:t xml:space="preserve">Pending Trinity</w:t>
             </w:r>
           </w:p>
@@ -2532,7 +2797,7 @@
                 <w:sz w:val="20"/>
                 <w:szCs w:val="20"/>
               </w:rPr>
-              <w:t xml:space="preserve">Item 2: switch-200V-8 1/1/7 - 1/1/9 (00:09:F5, same vendor as lv3/lv4 1/1/48 now on 2000). Trinity to confirm the device type, VLAN 2000 or 2100, and whether they have fixed addresses</w:t>
+              <w:t xml:space="preserve">Trinity to say whether ports moved to VLAN 1 should also be disabled (optional block in the file)</w:t>
             </w:r>
           </w:p>
         </w:tc>
@@ -2571,7 +2836,7 @@
                 <w:sz w:val="20"/>
                 <w:szCs w:val="20"/>
               </w:rPr>
-              <w:t xml:space="preserve">Item 3: LT2-2 1/1/1 is not the LT2-2 uplink (that is 1/1/12); Trinity to confirm no switch is to be connected before its trunk VLANs are removed</w:t>
+              <w:t xml:space="preserve">VLAN 2100 present on every switch and tagged on its uplink (checked in the 16 October export)</w:t>
             </w:r>
           </w:p>
         </w:tc>
@@ -2588,7 +2853,7 @@
                 <w:sz w:val="20"/>
                 <w:szCs w:val="20"/>
               </w:rPr>
-              <w:t xml:space="preserve">Pending Trinity</w:t>
+              <w:t xml:space="preserve">Complete</w:t>
             </w:r>
           </w:p>
         </w:tc>
@@ -2610,7 +2875,7 @@
                 <w:sz w:val="20"/>
                 <w:szCs w:val="20"/>
               </w:rPr>
-              <w:t xml:space="preserve">Trinity to say whether ports moved to VLAN 1 should also be disabled (optional block in the file)</w:t>
+              <w:t xml:space="preserve">Part B: 10.21.0.20 - 10.21.0.27 excluded from the 10.21.0.0/24 DHCP scope on 10.20.16.10 / 10.20.16.11</w:t>
             </w:r>
           </w:p>
         </w:tc>
@@ -2627,7 +2892,7 @@
                 <w:sz w:val="20"/>
                 <w:szCs w:val="20"/>
               </w:rPr>
-              <w:t xml:space="preserve">Pending Trinity</w:t>
+              <w:t xml:space="preserve">Complete (confirmed by Trinity 22 October)</w:t>
             </w:r>
           </w:p>
         </w:tc>
@@ -2649,7 +2914,7 @@
                 <w:sz w:val="20"/>
                 <w:szCs w:val="20"/>
               </w:rPr>
-              <w:t xml:space="preserve">VLAN 2100 present on every switch and tagged on its uplink (checked in the 16 October export)</w:t>
+              <w:t xml:space="preserve">Part B: SRX policy to allow the admin jump host (10.128.132.10) to reach 10.21.0.0/24 by SSH/telnet, and SNMP between 10.21.0.0/24 and 10.128.240.12. Not in the Sparx policy report; without it the switches are managed through SmartZone or from the core only</w:t>
             </w:r>
           </w:p>
         </w:tc>
@@ -2666,7 +2931,7 @@
                 <w:sz w:val="20"/>
                 <w:szCs w:val="20"/>
               </w:rPr>
-              <w:t xml:space="preserve">Complete</w:t>
+              <w:t xml:space="preserve">Pending decision</w:t>
             </w:r>
           </w:p>
         </w:tc>
@@ -2688,7 +2953,7 @@
                 <w:sz w:val="20"/>
                 <w:szCs w:val="20"/>
               </w:rPr>
-              <w:t xml:space="preserve">Part B: 10.21.0.20 - 10.21.0.27 excluded from the 10.21.0.0/24 DHCP scope on 10.20.16.10 / 10.20.16.11</w:t>
+              <w:t xml:space="preserve">Part B: ntp1.trinity.unimelb.edu.au resolves to one of the NTP servers the SRX allows for 10.21.0.0/24</w:t>
             </w:r>
           </w:p>
         </w:tc>
@@ -2705,85 +2970,7 @@
                 <w:sz w:val="20"/>
                 <w:szCs w:val="20"/>
               </w:rPr>
-              <w:t xml:space="preserve">Complete (confirmed by Trinity 22 October)</w:t>
-            </w:r>
-          </w:p>
-        </w:tc>
-      </w:tr>
-      <w:tr>
-        <w:trPr>
-          <w:cantSplit/>
-        </w:trPr>
-        <w:tc>
-          <w:tcPr>
-            <w:tcW w:w="7026" w:type="dxa"/>
-          </w:tcPr>
-          <w:p>
-            <w:pPr>
-              <w:spacing w:after="0" w:line="240" w:lineRule="auto"/>
-            </w:pPr>
-            <w:r>
-              <w:rPr>
-                <w:sz w:val="20"/>
-                <w:szCs w:val="20"/>
-              </w:rPr>
-              <w:t xml:space="preserve">Part B: SRX policy to allow the admin jump host (10.128.132.10) to reach 10.21.0.0/24 by SSH/telnet, and SNMP between 10.21.0.0/24 and 10.128.240.12. Not in the Sparx policy report; without it the switches are managed through SmartZone or from the core only</w:t>
-            </w:r>
-          </w:p>
-        </w:tc>
-        <w:tc>
-          <w:tcPr>
-            <w:tcW w:w="2000" w:type="dxa"/>
-          </w:tcPr>
-          <w:p>
-            <w:pPr>
-              <w:spacing w:after="0" w:line="240" w:lineRule="auto"/>
-            </w:pPr>
-            <w:r>
-              <w:rPr>
-                <w:sz w:val="20"/>
-                <w:szCs w:val="20"/>
-              </w:rPr>
-              <w:t xml:space="preserve">Pending decision</w:t>
-            </w:r>
-          </w:p>
-        </w:tc>
-      </w:tr>
-      <w:tr>
-        <w:trPr>
-          <w:cantSplit/>
-        </w:trPr>
-        <w:tc>
-          <w:tcPr>
-            <w:tcW w:w="7026" w:type="dxa"/>
-          </w:tcPr>
-          <w:p>
-            <w:pPr>
-              <w:spacing w:after="0" w:line="240" w:lineRule="auto"/>
-            </w:pPr>
-            <w:r>
-              <w:rPr>
-                <w:sz w:val="20"/>
-                <w:szCs w:val="20"/>
-              </w:rPr>
-              <w:t xml:space="preserve">Part B: ntp1.trinity.unimelb.edu.au resolves to one of the NTP servers the SRX allows for 10.21.0.0/24</w:t>
-            </w:r>
-          </w:p>
-        </w:tc>
-        <w:tc>
-          <w:tcPr>
-            <w:tcW w:w="2000" w:type="dxa"/>
-          </w:tcPr>
-          <w:p>
-            <w:pPr>
-              <w:spacing w:after="0" w:line="240" w:lineRule="auto"/>
-            </w:pPr>
-            <w:r>
-              <w:rPr>
-                <w:sz w:val="20"/>
-                <w:szCs w:val="20"/>
-              </w:rPr>
-              <w:t xml:space="preserve">Pending check</w:t>
+              <w:t xml:space="preserve">Complete (checked 22 October)</w:t>
             </w:r>
           </w:p>
         </w:tc>
@@ -3108,6 +3295,19 @@
         <w:spacing w:after="60"/>
       </w:pPr>
       <w:r>
+        <w:t xml:space="preserve">If the UPS cards keep their 10.9.9.x addresses on VL-netmgmt-01, then UPS monitoring of them stops. This is likely unless they use DHCP. If this risk occurs, give them 10.21.0.x addresses (DHCP or fixed, outside 10.21.0.20 - .27).</w:t>
+      </w:r>
+    </w:p>
+    <w:p>
+      <w:pPr>
+        <w:pStyle w:val="ListParagraph"/>
+        <w:numPr>
+          <w:ilvl w:val="0"/>
+          <w:numId w:val="5"/>
+        </w:numPr>
+        <w:spacing w:after="60"/>
+      </w:pPr>
+      <w:r>
         <w:t xml:space="preserve">If a port moved to VLAN 1 is needed by a device that was switched off on 16 October (for example an AV device), then that device gets no network when it is turned on. This has low likelihood because no MAC was seen on these ports in the export. If this risk occurs, assign the port its VLAN (2700 for AV).</w:t>
       </w:r>
     </w:p>
@@ -3178,7 +3378,7 @@
     </w:p>
     <w:p>
       <w:r>
-        <w:t xml:space="preserve">Early morning or after hours, about 1 hour, once Trinity have approved the change and answered items 1 to 3. The ports that are down can be done at any time. Part B can be done in business hours (no user impact) (the DHCP exclusion is confirmed) once the SRX access decision is made.</w:t>
+        <w:t xml:space="preserve">Early morning or after hours, about 1 hour, once Trinity have approved the change. LT2-2 1/1/1 waits for item 3. The ports that are down can be done at any time. Part B can be done in business hours (no user impact) (the DHCP exclusion is confirmed) once the SRX access decision is made.</w:t>
       </w:r>
     </w:p>
     <w:p>
@@ -3781,7 +3981,7 @@
                 <w:sz w:val="20"/>
                 <w:szCs w:val="20"/>
               </w:rPr>
-              <w:t xml:space="preserve">Pending: item 1: 20:7B:D2:30:98:C1 (200V3J14) seen 15 Oct; Trinity said default VLAN</w:t>
+              <w:t xml:space="preserve">Down</w:t>
             </w:r>
           </w:p>
         </w:tc>
@@ -9631,7 +9831,7 @@
                 <w:sz w:val="20"/>
                 <w:szCs w:val="20"/>
               </w:rPr>
-              <w:t xml:space="preserve">Pending: item 1: 20:7B:D2:30:99:15 (200V4H9) seen 14 Oct; Trinity said default VLAN</w:t>
+              <w:t xml:space="preserve">Down</w:t>
             </w:r>
           </w:p>
         </w:tc>
@@ -10441,7 +10641,7 @@
                 <w:sz w:val="20"/>
                 <w:szCs w:val="20"/>
               </w:rPr>
-              <w:t xml:space="preserve">Pending: item 1: 20:7B:D2:30:99:25 (200V4I17) seen 14 Oct; Trinity said default VLAN</w:t>
+              <w:t xml:space="preserve">Down</w:t>
             </w:r>
           </w:p>
         </w:tc>
@@ -26984,7 +27184,7 @@
                 <w:sz w:val="20"/>
                 <w:szCs w:val="20"/>
               </w:rPr>
-              <w:t xml:space="preserve">2000 or 2100</w:t>
+              <w:t xml:space="preserve">2000</w:t>
             </w:r>
           </w:p>
         </w:tc>
@@ -27001,7 +27201,7 @@
                 <w:sz w:val="20"/>
                 <w:szCs w:val="20"/>
               </w:rPr>
-              <w:t xml:space="preserve">Pending: item 2: 00:09:F5:32:DB:15 (10.9.9.97), device type to confirm</w:t>
+              <w:t xml:space="preserve">Up, 00:09:F5:32:DB:15</w:t>
             </w:r>
           </w:p>
         </w:tc>
@@ -27074,7 +27274,7 @@
                 <w:sz w:val="20"/>
                 <w:szCs w:val="20"/>
               </w:rPr>
-              <w:t xml:space="preserve">2000 or 2100</w:t>
+              <w:t xml:space="preserve">2000</w:t>
             </w:r>
           </w:p>
         </w:tc>
@@ -27091,7 +27291,7 @@
                 <w:sz w:val="20"/>
                 <w:szCs w:val="20"/>
               </w:rPr>
-              <w:t xml:space="preserve">Pending: item 2: 00:09:F5:32:DB:D1 (10.9.9.96), device type to confirm</w:t>
+              <w:t xml:space="preserve">Up, 00:09:F5:32:DB:D1</w:t>
             </w:r>
           </w:p>
         </w:tc>
@@ -27164,7 +27364,7 @@
                 <w:sz w:val="20"/>
                 <w:szCs w:val="20"/>
               </w:rPr>
-              <w:t xml:space="preserve">2000 or 2100</w:t>
+              <w:t xml:space="preserve">2000</w:t>
             </w:r>
           </w:p>
         </w:tc>
@@ -27181,7 +27381,7 @@
                 <w:sz w:val="20"/>
                 <w:szCs w:val="20"/>
               </w:rPr>
-              <w:t xml:space="preserve">Pending: item 2: 00:09:F5:32:DB:14 (10.9.9.95), device type to confirm</w:t>
+              <w:t xml:space="preserve">Up, 00:09:F5:32:DB:14</w:t>
             </w:r>
           </w:p>
         </w:tc>

</xml_diff>

<commit_message>
Port clean-up: VLAN 1 ports stay enabled (decision 22 Oct)
Removes the optional port-disable block.

Co-Authored-By: Claude Opus 5.5 <noreply@anthropic.com>
Claude-Session: https://claude.ai/code/session_01BZ7jJsE6GWKm6ehHY39VNr
</commit_message>
<xml_diff>
--- a/Trinity 200V Port Clean-up Change.docx
+++ b/Trinity 200V Port Clean-up Change.docx
@@ -1411,7 +1411,7 @@
                 <w:sz w:val="20"/>
                 <w:szCs w:val="20"/>
               </w:rPr>
-              <w:t xml:space="preserve">200V-port-review-16oct-ICX.txt (per switch: pre-check, change, port bounce, verify, rollback; pending blocks; optional port shutdown)</w:t>
+              <w:t xml:space="preserve">200V-port-review-16oct-ICX.txt (per switch: pre-check, change, port bounce, verify, rollback; pending block)</w:t>
             </w:r>
           </w:p>
         </w:tc>
@@ -2797,7 +2797,7 @@
                 <w:sz w:val="20"/>
                 <w:szCs w:val="20"/>
               </w:rPr>
-              <w:t xml:space="preserve">Trinity to say whether ports moved to VLAN 1 should also be disabled (optional block in the file)</w:t>
+              <w:t xml:space="preserve">Ports moved to VLAN 1: stay enabled on VLAN 1, or also be disabled</w:t>
             </w:r>
           </w:p>
         </w:tc>
@@ -2814,7 +2814,7 @@
                 <w:sz w:val="20"/>
                 <w:szCs w:val="20"/>
               </w:rPr>
-              <w:t xml:space="preserve">Pending Trinity</w:t>
+              <w:t xml:space="preserve">Complete (22 October: stay enabled on VLAN 1)</w:t>
             </w:r>
           </w:p>
         </w:tc>

</xml_diff>

<commit_message>
Port clean-up CIP: backups Monday 26 Oct morning, window 6-7 pm
Co-Authored-By: Claude Opus 5.5 <noreply@anthropic.com>
Claude-Session: https://claude.ai/code/session_01BZ7jJsE6GWKm6ehHY39VNr
</commit_message>
<xml_diff>
--- a/Trinity 200V Port Clean-up Change.docx
+++ b/Trinity 200V Port Clean-up Change.docx
@@ -2658,7 +2658,7 @@
                 <w:sz w:val="20"/>
                 <w:szCs w:val="20"/>
               </w:rPr>
-              <w:t xml:space="preserve">Pending</w:t>
+              <w:t xml:space="preserve">Scheduled: Monday 26 October 2026, morning</w:t>
             </w:r>
           </w:p>
         </w:tc>
@@ -3378,7 +3378,12 @@
     </w:p>
     <w:p>
       <w:r>
-        <w:t xml:space="preserve">Early morning or after hours, about 1 hour, once Trinity have approved the change. LT2-2 1/1/1 waits for item 3. The ports that are down can be done at any time. Part B can be done in business hours (no user impact) (the DHCP exclusion is confirmed) once the SRX access decision is made.</w:t>
+        <w:t xml:space="preserve">Change window: Monday 26 October 2026, 6:00 pm to 7:00 pm, after the switch backups taken that morning.</w:t>
+      </w:r>
+    </w:p>
+    <w:p>
+      <w:r>
+        <w:t xml:space="preserve">Part A (port clean-up) is done first and takes about 1 hour across the eight switches, so it fills the window. Order: lv6 (144 ports), lv4, lv3, then the smaller switches. Part B (management to VLAN 2000) takes about 1.5 hours and has no user impact: start it in the window only if Part A finishes early (pilot Tutorial-6.03 first), otherwise schedule it separately, in business hours if preferred, once the SRX access decision is made. LT2-2 1/1/1 waits for Trinity's answer to item 3.</w:t>
       </w:r>
     </w:p>
     <w:p>

</xml_diff>

<commit_message>
Port clean-up: UPS cards use DHCP
Co-Authored-By: Claude Opus 5.5 <noreply@anthropic.com>
Claude-Session: https://claude.ai/code/session_01BZ7jJsE6GWKm6ehHY39VNr
</commit_message>
<xml_diff>
--- a/Trinity 200V Port Clean-up Change.docx
+++ b/Trinity 200V Port Clean-up Change.docx
@@ -2212,7 +2212,7 @@
         <w:spacing w:after="60"/>
       </w:pPr>
       <w:r>
-        <w:t xml:space="preserve">The three UPS cards (switch-200V-8 1/1/7 - 1/1/9, 10.9.9.95 - .97) need DHCP or a fixed 10.21.0.x address (outside 10.21.0.20 - .27) before they are reachable on VL-netmgmt-01</w:t>
+        <w:t xml:space="preserve">The three UPS cards (switch-200V-8 1/1/7 - 1/1/9, now 10.9.9.95 - .97) use DHCP: after the bounce they get new addresses on 10.21.0.0/24 (VL-netmgmt-01). Anything that monitors them by IP address needs updating</w:t>
       </w:r>
     </w:p>
     <w:p>
@@ -2736,7 +2736,7 @@
                 <w:sz w:val="20"/>
                 <w:szCs w:val="20"/>
               </w:rPr>
-              <w:t xml:space="preserve">Complete (Trinity 22 October: UPS cards, 2000). Addressing of the cards on 10.21.0.0/24 still to be set</w:t>
+              <w:t xml:space="preserve">Complete (Trinity 22 October: UPS cards, 2000; the cards use DHCP)</w:t>
             </w:r>
           </w:p>
         </w:tc>
@@ -3295,7 +3295,7 @@
         <w:spacing w:after="60"/>
       </w:pPr>
       <w:r>
-        <w:t xml:space="preserve">If the UPS cards keep their 10.9.9.x addresses on VL-netmgmt-01, then UPS monitoring of them stops. This is likely unless they use DHCP. If this risk occurs, give them 10.21.0.x addresses (DHCP or fixed, outside 10.21.0.20 - .27).</w:t>
+        <w:t xml:space="preserve">If the UPS cards do not renew DHCP after the port bounce, then they keep their old 10.9.9.x address and cannot be reached. This has low likelihood because the bounce drops the link. If this risk occurs, bounce the port again or power cycle the card's network module.</w:t>
       </w:r>
     </w:p>
     <w:p>

</xml_diff>

<commit_message>
Mgmt config: remove SRX notes; CIP tidied for submission
Co-Authored-By: Claude Opus 5.5 <noreply@anthropic.com>
Claude-Session: https://claude.ai/code/session_01BZ7jJsE6GWKm6ehHY39VNr
</commit_message>
<xml_diff>
--- a/Trinity 200V Port Clean-up Change.docx
+++ b/Trinity 200V Port Clean-up Change.docx
@@ -22,7 +22,7 @@
     </w:p>
     <w:p>
       <w:r>
-        <w:t xml:space="preserve">Part A, port clean-up. Clean up 267 access ports on eight 200V switches as recommended by Trinity in column Q of Trinity_switch_ports_16-10-2026.xlsx (SmartZone export, 16 October 2026). Ports still on the old staff VLAN 1240 move to VL-staff-wired-01 (2100); unused ports still on old VLANs (mostly the old AV VLAN 1230) are returned to the default VLAN (VLAN 1); three UPS management cards move to VL-netmgmt-01 (2000); and old trunk (tagged) VLANs are removed from access ports where Trinity asked. Trinity's answers of 22 October to the review email are included. 267 ports are in this change.</w:t>
+        <w:t xml:space="preserve">Part A, port clean-up. Clean up 267 access ports on eight 200V switches as recommended by Trinity in column Q of Trinity_switch_ports_16-10-2026.xlsx (SmartZone export, 16 October 2026). Ports still on the old staff VLAN 1240 move to VL-staff-wired-01 (2100); unused ports still on old VLANs (mostly the old AV VLAN 1230) are returned to the default VLAN (VLAN 1); three UPS management cards move to VL-netmgmt-01 (2000); and old trunk (tagged) VLANs are removed from access ports where Trinity asked, with the port decisions agreed with Trinity on 22 October. 267 ports are in this change.</w:t>
       </w:r>
     </w:p>
     <w:p>
@@ -2667,7 +2667,7 @@
                 <w:sz w:val="20"/>
                 <w:szCs w:val="20"/>
               </w:rPr>
-              <w:t xml:space="preserve">Item 1: lv3 2/1/27, lv4 4/1/32 and lv4 5/1/19 have the last three 20:7B:D2 devices on them (seen 14 - 15 October). Trinity marked them default VLAN; Dycom proposes 2100 like the other 13 (decision of 9 October)</w:t>
+              <w:t xml:space="preserve">Port decisions agreed with Trinity (22 October): lv3 2/1/27, lv4 4/1/32 and lv4 5/1/19 (20:7B:D2 devices) to 2100; switch-200V-8 1/1/7 - 1/1/9 (UPS management cards, DHCP) to 2000; LT2-2 1/1/1 old VLANs removed, new VLANs 2000 - 2953 stay tagged; ports moved to VLAN 1 stay enabled</w:t>
             </w:r>
           </w:p>
         </w:tc>
@@ -2684,124 +2684,7 @@
                 <w:sz w:val="20"/>
                 <w:szCs w:val="20"/>
               </w:rPr>
-              <w:t xml:space="preserve">Complete (Trinity 22 October: 2100)</w:t>
-            </w:r>
-          </w:p>
-        </w:tc>
-      </w:tr>
-      <w:tr>
-        <w:trPr>
-          <w:cantSplit/>
-        </w:trPr>
-        <w:tc>
-          <w:tcPr>
-            <w:tcW w:w="7026" w:type="dxa"/>
-          </w:tcPr>
-          <w:p>
-            <w:pPr>
-              <w:spacing w:after="0" w:line="240" w:lineRule="auto"/>
-            </w:pPr>
-            <w:r>
-              <w:rPr>
-                <w:sz w:val="20"/>
-                <w:szCs w:val="20"/>
-              </w:rPr>
-              <w:t xml:space="preserve">Item 2: switch-200V-8 1/1/7 - 1/1/9 (00:09:F5, same vendor as lv3/lv4 1/1/48 now on 2000). Trinity to confirm the device type, VLAN 2000 or 2100, and whether they have fixed addresses</w:t>
-            </w:r>
-          </w:p>
-        </w:tc>
-        <w:tc>
-          <w:tcPr>
-            <w:tcW w:w="2000" w:type="dxa"/>
-          </w:tcPr>
-          <w:p>
-            <w:pPr>
-              <w:spacing w:after="0" w:line="240" w:lineRule="auto"/>
-            </w:pPr>
-            <w:r>
-              <w:rPr>
-                <w:sz w:val="20"/>
-                <w:szCs w:val="20"/>
-              </w:rPr>
-              <w:t xml:space="preserve">Complete (Trinity 22 October: UPS cards, 2000; the cards use DHCP)</w:t>
-            </w:r>
-          </w:p>
-        </w:tc>
-      </w:tr>
-      <w:tr>
-        <w:trPr>
-          <w:cantSplit/>
-        </w:trPr>
-        <w:tc>
-          <w:tcPr>
-            <w:tcW w:w="7026" w:type="dxa"/>
-          </w:tcPr>
-          <w:p>
-            <w:pPr>
-              <w:spacing w:after="0" w:line="240" w:lineRule="auto"/>
-            </w:pPr>
-            <w:r>
-              <w:rPr>
-                <w:sz w:val="20"/>
-                <w:szCs w:val="20"/>
-              </w:rPr>
-              <w:t xml:space="preserve">Item 3: LT2-2 1/1/1 is not the LT2-2 uplink (that is 1/1/12); decide what to remove</w:t>
-            </w:r>
-          </w:p>
-        </w:tc>
-        <w:tc>
-          <w:tcPr>
-            <w:tcW w:w="2000" w:type="dxa"/>
-          </w:tcPr>
-          <w:p>
-            <w:pPr>
-              <w:spacing w:after="0" w:line="240" w:lineRule="auto"/>
-            </w:pPr>
-            <w:r>
-              <w:rPr>
-                <w:sz w:val="20"/>
-                <w:szCs w:val="20"/>
-              </w:rPr>
-              <w:t xml:space="preserve">Complete (22 October: remove the old VLANs only; the port stays a tagged-only trunk with 2000 - 2953)</w:t>
-            </w:r>
-          </w:p>
-        </w:tc>
-      </w:tr>
-      <w:tr>
-        <w:trPr>
-          <w:cantSplit/>
-        </w:trPr>
-        <w:tc>
-          <w:tcPr>
-            <w:tcW w:w="7026" w:type="dxa"/>
-          </w:tcPr>
-          <w:p>
-            <w:pPr>
-              <w:spacing w:after="0" w:line="240" w:lineRule="auto"/>
-            </w:pPr>
-            <w:r>
-              <w:rPr>
-                <w:sz w:val="20"/>
-                <w:szCs w:val="20"/>
-              </w:rPr>
-              <w:t xml:space="preserve">Ports moved to VLAN 1: stay enabled on VLAN 1, or also be disabled</w:t>
-            </w:r>
-          </w:p>
-        </w:tc>
-        <w:tc>
-          <w:tcPr>
-            <w:tcW w:w="2000" w:type="dxa"/>
-          </w:tcPr>
-          <w:p>
-            <w:pPr>
-              <w:spacing w:after="0" w:line="240" w:lineRule="auto"/>
-            </w:pPr>
-            <w:r>
-              <w:rPr>
-                <w:sz w:val="20"/>
-                <w:szCs w:val="20"/>
-              </w:rPr>
-              <w:t xml:space="preserve">Complete (22 October: stay enabled on VLAN 1)</w:t>
+              <w:t xml:space="preserve">Complete</w:t>
             </w:r>
           </w:p>
         </w:tc>

</xml_diff>

<commit_message>
Record 26 Oct port clean-up and management move
All 8 access switches done: 267 ports changed, management moved to
10.21.0.20-.27 on ve 2000. CIP implementation record, workbook Switches
tab and new 'Port clean-up 26 Oct' tab, migration doc section, configs
marked applied with the method used.

Co-Authored-By: Claude Opus 5.5 <noreply@anthropic.com>
Claude-Session: https://claude.ai/code/session_01BZ7jJsE6GWKm6ehHY39VNr
</commit_message>
<xml_diff>
--- a/Trinity 200V Port Clean-up Change.docx
+++ b/Trinity 200V Port Clean-up Change.docx
@@ -2645,7 +2645,7 @@
                 <w:sz w:val="20"/>
                 <w:szCs w:val="20"/>
               </w:rPr>
-              <w:t xml:space="preserve">Scheduled: Monday 26 October 2026, morning</w:t>
+              <w:t xml:space="preserve">Complete (26 October 2026, morning)</w:t>
             </w:r>
           </w:p>
         </w:tc>
@@ -3157,12 +3157,1012 @@
     </w:p>
     <w:p>
       <w:r>
-        <w:t xml:space="preserve">Change window: Monday 26 October 2026, 6:00 pm to 7:00 pm, after the switch backups taken that morning.</w:t>
+        <w:t xml:space="preserve">Change window: Monday 26 October 2026, 6:00 pm to 11:00 pm (extended from 6:00 - 7:00 pm to cover both parts), after the switch backups taken that morning.</w:t>
       </w:r>
     </w:p>
     <w:p>
       <w:r>
-        <w:t xml:space="preserve">Part A (port clean-up) is done first and takes about 1 hour across the eight switches, so it fills the window. Order: lv6 (144 ports), lv4, lv3, then the smaller switches. Part B (management to VLAN 2000) takes about 1.5 hours and has no user impact: start it in the window only if Part A finishes early (pilot Tutorial-6.03 first), otherwise schedule it separately, in business hours if preferred.</w:t>
+        <w:t xml:space="preserve">Both parts are done in the window, one switch at a time: Part A, write memory, then Part B. Order: lv6 (144 ports), lv4, lv3, then the smaller switches.</w:t>
+      </w:r>
+    </w:p>
+    <w:p>
+      <w:pPr>
+        <w:keepNext/>
+        <w:spacing w:before="240" w:after="120"/>
+      </w:pPr>
+      <w:r>
+        <w:rPr>
+          <w:b/>
+          <w:bCs/>
+        </w:rPr>
+        <w:t xml:space="preserve">Implementation record – 26 October 2026</w:t>
+      </w:r>
+    </w:p>
+    <w:p>
+      <w:r>
+        <w:t xml:space="preserve">Implemented by Alam Singh (Dycom) on Monday 26 October 2026 in the 6:00 pm - 11:00 pm window, after the switch backups that morning. Both parts were completed on all eight switches, one switch at a time (Part A, write memory, then Part B). The pre-checks for lv6, lv4 and lv3 were cross-checked against the 16 October export and matched; no port had to be left out.</w:t>
+      </w:r>
+    </w:p>
+    <w:p>
+      <w:pPr>
+        <w:spacing w:after="80"/>
+      </w:pPr>
+    </w:p>
+    <w:tbl>
+      <w:tblPr>
+        <w:tblW w:w="9026" w:type="dxa"/>
+        <w:tblBorders>
+          <w:top w:val="single" w:sz="4" w:space="0" w:color="A6A6A6"/>
+          <w:left w:val="single" w:sz="4" w:space="0" w:color="A6A6A6"/>
+          <w:bottom w:val="single" w:sz="4" w:space="0" w:color="A6A6A6"/>
+          <w:right w:val="single" w:sz="4" w:space="0" w:color="A6A6A6"/>
+          <w:insideH w:val="single" w:sz="4" w:space="0" w:color="A6A6A6"/>
+          <w:insideV w:val="single" w:sz="4" w:space="0" w:color="A6A6A6"/>
+        </w:tblBorders>
+        <w:tblLayout w:type="fixed"/>
+        <w:tblCellMar>
+          <w:top w:w="40" w:type="dxa"/>
+          <w:left w:w="80" w:type="dxa"/>
+          <w:bottom w:w="40" w:type="dxa"/>
+          <w:right w:w="80" w:type="dxa"/>
+        </w:tblCellMar>
+      </w:tblPr>
+      <w:tblGrid>
+        <w:gridCol w:w="2346"/>
+        <w:gridCol w:w="902"/>
+        <w:gridCol w:w="1263"/>
+        <w:gridCol w:w="812"/>
+        <w:gridCol w:w="3703"/>
+      </w:tblGrid>
+      <w:tr>
+        <w:trPr>
+          <w:cantSplit/>
+          <w:tblHeader/>
+        </w:trPr>
+        <w:tc>
+          <w:tcPr>
+            <w:tcW w:w="2346" w:type="dxa"/>
+            <w:shd w:val="clear" w:color="auto" w:fill="D9D9D9"/>
+          </w:tcPr>
+          <w:p>
+            <w:pPr>
+              <w:spacing w:after="0" w:line="240" w:lineRule="auto"/>
+            </w:pPr>
+            <w:r>
+              <w:rPr>
+                <w:b/>
+                <w:bCs/>
+                <w:sz w:val="20"/>
+                <w:szCs w:val="20"/>
+              </w:rPr>
+              <w:t xml:space="preserve">Switch</w:t>
+            </w:r>
+          </w:p>
+        </w:tc>
+        <w:tc>
+          <w:tcPr>
+            <w:tcW w:w="902" w:type="dxa"/>
+            <w:shd w:val="clear" w:color="auto" w:fill="D9D9D9"/>
+          </w:tcPr>
+          <w:p>
+            <w:pPr>
+              <w:spacing w:after="0" w:line="240" w:lineRule="auto"/>
+            </w:pPr>
+            <w:r>
+              <w:rPr>
+                <w:b/>
+                <w:bCs/>
+                <w:sz w:val="20"/>
+                <w:szCs w:val="20"/>
+              </w:rPr>
+              <w:t xml:space="preserve">Part A ports</w:t>
+            </w:r>
+          </w:p>
+        </w:tc>
+        <w:tc>
+          <w:tcPr>
+            <w:tcW w:w="1263" w:type="dxa"/>
+            <w:shd w:val="clear" w:color="auto" w:fill="D9D9D9"/>
+          </w:tcPr>
+          <w:p>
+            <w:pPr>
+              <w:spacing w:after="0" w:line="240" w:lineRule="auto"/>
+            </w:pPr>
+            <w:r>
+              <w:rPr>
+                <w:b/>
+                <w:bCs/>
+                <w:sz w:val="20"/>
+                <w:szCs w:val="20"/>
+              </w:rPr>
+              <w:t xml:space="preserve">Part B address</w:t>
+            </w:r>
+          </w:p>
+        </w:tc>
+        <w:tc>
+          <w:tcPr>
+            <w:tcW w:w="812" w:type="dxa"/>
+            <w:shd w:val="clear" w:color="auto" w:fill="D9D9D9"/>
+          </w:tcPr>
+          <w:p>
+            <w:pPr>
+              <w:spacing w:after="0" w:line="240" w:lineRule="auto"/>
+            </w:pPr>
+            <w:r>
+              <w:rPr>
+                <w:b/>
+                <w:bCs/>
+                <w:sz w:val="20"/>
+                <w:szCs w:val="20"/>
+              </w:rPr>
+              <w:t xml:space="preserve">Status</w:t>
+            </w:r>
+          </w:p>
+        </w:tc>
+        <w:tc>
+          <w:tcPr>
+            <w:tcW w:w="3703" w:type="dxa"/>
+            <w:shd w:val="clear" w:color="auto" w:fill="D9D9D9"/>
+          </w:tcPr>
+          <w:p>
+            <w:pPr>
+              <w:spacing w:after="0" w:line="240" w:lineRule="auto"/>
+            </w:pPr>
+            <w:r>
+              <w:rPr>
+                <w:b/>
+                <w:bCs/>
+                <w:sz w:val="20"/>
+                <w:szCs w:val="20"/>
+              </w:rPr>
+              <w:t xml:space="preserve">Notes</w:t>
+            </w:r>
+          </w:p>
+        </w:tc>
+      </w:tr>
+      <w:tr>
+        <w:trPr>
+          <w:cantSplit/>
+        </w:trPr>
+        <w:tc>
+          <w:tcPr>
+            <w:tcW w:w="2346" w:type="dxa"/>
+          </w:tcPr>
+          <w:p>
+            <w:pPr>
+              <w:spacing w:after="0" w:line="240" w:lineRule="auto"/>
+            </w:pPr>
+            <w:r>
+              <w:rPr>
+                <w:sz w:val="20"/>
+                <w:szCs w:val="20"/>
+              </w:rPr>
+              <w:t xml:space="preserve">switch-200V-stack-lv6</w:t>
+            </w:r>
+          </w:p>
+        </w:tc>
+        <w:tc>
+          <w:tcPr>
+            <w:tcW w:w="902" w:type="dxa"/>
+          </w:tcPr>
+          <w:p>
+            <w:pPr>
+              <w:spacing w:after="0" w:line="240" w:lineRule="auto"/>
+            </w:pPr>
+            <w:r>
+              <w:rPr>
+                <w:sz w:val="20"/>
+                <w:szCs w:val="20"/>
+              </w:rPr>
+              <w:t xml:space="preserve">144</w:t>
+            </w:r>
+          </w:p>
+        </w:tc>
+        <w:tc>
+          <w:tcPr>
+            <w:tcW w:w="1263" w:type="dxa"/>
+          </w:tcPr>
+          <w:p>
+            <w:pPr>
+              <w:spacing w:after="0" w:line="240" w:lineRule="auto"/>
+            </w:pPr>
+            <w:r>
+              <w:rPr>
+                <w:sz w:val="20"/>
+                <w:szCs w:val="20"/>
+              </w:rPr>
+              <w:t xml:space="preserve">10.21.0.20</w:t>
+            </w:r>
+          </w:p>
+        </w:tc>
+        <w:tc>
+          <w:tcPr>
+            <w:tcW w:w="812" w:type="dxa"/>
+          </w:tcPr>
+          <w:p>
+            <w:pPr>
+              <w:spacing w:after="0" w:line="240" w:lineRule="auto"/>
+            </w:pPr>
+            <w:r>
+              <w:rPr>
+                <w:sz w:val="20"/>
+                <w:szCs w:val="20"/>
+              </w:rPr>
+              <w:t xml:space="preserve">Done</w:t>
+            </w:r>
+          </w:p>
+        </w:tc>
+        <w:tc>
+          <w:tcPr>
+            <w:tcW w:w="3703" w:type="dxa"/>
+          </w:tcPr>
+          <w:p>
+            <w:pPr>
+              <w:spacing w:after="0" w:line="240" w:lineRule="auto"/>
+            </w:pPr>
+            <w:r>
+              <w:rPr>
+                <w:sz w:val="20"/>
+                <w:szCs w:val="20"/>
+              </w:rPr>
+              <w:t xml:space="preserve">VLAN 2100 after the change matched the plan (143 untagged ports). 1/1/32 up on 2100 but no MAC learned when checked</w:t>
+            </w:r>
+          </w:p>
+        </w:tc>
+      </w:tr>
+      <w:tr>
+        <w:trPr>
+          <w:cantSplit/>
+        </w:trPr>
+        <w:tc>
+          <w:tcPr>
+            <w:tcW w:w="2346" w:type="dxa"/>
+          </w:tcPr>
+          <w:p>
+            <w:pPr>
+              <w:spacing w:after="0" w:line="240" w:lineRule="auto"/>
+            </w:pPr>
+            <w:r>
+              <w:rPr>
+                <w:sz w:val="20"/>
+                <w:szCs w:val="20"/>
+              </w:rPr>
+              <w:t xml:space="preserve">switch-200V-stack-lv4</w:t>
+            </w:r>
+          </w:p>
+        </w:tc>
+        <w:tc>
+          <w:tcPr>
+            <w:tcW w:w="902" w:type="dxa"/>
+          </w:tcPr>
+          <w:p>
+            <w:pPr>
+              <w:spacing w:after="0" w:line="240" w:lineRule="auto"/>
+            </w:pPr>
+            <w:r>
+              <w:rPr>
+                <w:sz w:val="20"/>
+                <w:szCs w:val="20"/>
+              </w:rPr>
+              <w:t xml:space="preserve">54</w:t>
+            </w:r>
+          </w:p>
+        </w:tc>
+        <w:tc>
+          <w:tcPr>
+            <w:tcW w:w="1263" w:type="dxa"/>
+          </w:tcPr>
+          <w:p>
+            <w:pPr>
+              <w:spacing w:after="0" w:line="240" w:lineRule="auto"/>
+            </w:pPr>
+            <w:r>
+              <w:rPr>
+                <w:sz w:val="20"/>
+                <w:szCs w:val="20"/>
+              </w:rPr>
+              <w:t xml:space="preserve">10.21.0.26</w:t>
+            </w:r>
+          </w:p>
+        </w:tc>
+        <w:tc>
+          <w:tcPr>
+            <w:tcW w:w="812" w:type="dxa"/>
+          </w:tcPr>
+          <w:p>
+            <w:pPr>
+              <w:spacing w:after="0" w:line="240" w:lineRule="auto"/>
+            </w:pPr>
+            <w:r>
+              <w:rPr>
+                <w:sz w:val="20"/>
+                <w:szCs w:val="20"/>
+              </w:rPr>
+              <w:t xml:space="preserve">Done</w:t>
+            </w:r>
+          </w:p>
+        </w:tc>
+        <w:tc>
+          <w:tcPr>
+            <w:tcW w:w="3703" w:type="dxa"/>
+          </w:tcPr>
+          <w:p>
+            <w:pPr>
+              <w:spacing w:after="0" w:line="240" w:lineRule="auto"/>
+            </w:pPr>
+            <w:r>
+              <w:rPr>
+                <w:sz w:val="20"/>
+                <w:szCs w:val="20"/>
+              </w:rPr>
+              <w:t xml:space="preserve">SmartZone returned HTTP 500 until the old address was removed and the agent restarted</w:t>
+            </w:r>
+          </w:p>
+        </w:tc>
+      </w:tr>
+      <w:tr>
+        <w:trPr>
+          <w:cantSplit/>
+        </w:trPr>
+        <w:tc>
+          <w:tcPr>
+            <w:tcW w:w="2346" w:type="dxa"/>
+          </w:tcPr>
+          <w:p>
+            <w:pPr>
+              <w:spacing w:after="0" w:line="240" w:lineRule="auto"/>
+            </w:pPr>
+            <w:r>
+              <w:rPr>
+                <w:sz w:val="20"/>
+                <w:szCs w:val="20"/>
+              </w:rPr>
+              <w:t xml:space="preserve">switch-200V-stack-lv3</w:t>
+            </w:r>
+          </w:p>
+        </w:tc>
+        <w:tc>
+          <w:tcPr>
+            <w:tcW w:w="902" w:type="dxa"/>
+          </w:tcPr>
+          <w:p>
+            <w:pPr>
+              <w:spacing w:after="0" w:line="240" w:lineRule="auto"/>
+            </w:pPr>
+            <w:r>
+              <w:rPr>
+                <w:sz w:val="20"/>
+                <w:szCs w:val="20"/>
+              </w:rPr>
+              <w:t xml:space="preserve">32</w:t>
+            </w:r>
+          </w:p>
+        </w:tc>
+        <w:tc>
+          <w:tcPr>
+            <w:tcW w:w="1263" w:type="dxa"/>
+          </w:tcPr>
+          <w:p>
+            <w:pPr>
+              <w:spacing w:after="0" w:line="240" w:lineRule="auto"/>
+            </w:pPr>
+            <w:r>
+              <w:rPr>
+                <w:sz w:val="20"/>
+                <w:szCs w:val="20"/>
+              </w:rPr>
+              <w:t xml:space="preserve">10.21.0.27</w:t>
+            </w:r>
+          </w:p>
+        </w:tc>
+        <w:tc>
+          <w:tcPr>
+            <w:tcW w:w="812" w:type="dxa"/>
+          </w:tcPr>
+          <w:p>
+            <w:pPr>
+              <w:spacing w:after="0" w:line="240" w:lineRule="auto"/>
+            </w:pPr>
+            <w:r>
+              <w:rPr>
+                <w:sz w:val="20"/>
+                <w:szCs w:val="20"/>
+              </w:rPr>
+              <w:t xml:space="preserve">Done</w:t>
+            </w:r>
+          </w:p>
+        </w:tc>
+        <w:tc>
+          <w:tcPr>
+            <w:tcW w:w="3703" w:type="dxa"/>
+          </w:tcPr>
+          <w:p>
+            <w:pPr>
+              <w:spacing w:after="0" w:line="240" w:lineRule="auto"/>
+            </w:pPr>
+            <w:r>
+              <w:rPr>
+                <w:sz w:val="20"/>
+                <w:szCs w:val="20"/>
+              </w:rPr>
+              <w:t xml:space="preserve">First attempt did not reconnect; the 10-minute reload timer restored it (7:06 pm, Part A kept). Second attempt with the combined step succeeded</w:t>
+            </w:r>
+          </w:p>
+        </w:tc>
+      </w:tr>
+      <w:tr>
+        <w:trPr>
+          <w:cantSplit/>
+        </w:trPr>
+        <w:tc>
+          <w:tcPr>
+            <w:tcW w:w="2346" w:type="dxa"/>
+          </w:tcPr>
+          <w:p>
+            <w:pPr>
+              <w:spacing w:after="0" w:line="240" w:lineRule="auto"/>
+            </w:pPr>
+            <w:r>
+              <w:rPr>
+                <w:sz w:val="20"/>
+                <w:szCs w:val="20"/>
+              </w:rPr>
+              <w:t xml:space="preserve">switch-200V-LT2-2</w:t>
+            </w:r>
+          </w:p>
+        </w:tc>
+        <w:tc>
+          <w:tcPr>
+            <w:tcW w:w="902" w:type="dxa"/>
+          </w:tcPr>
+          <w:p>
+            <w:pPr>
+              <w:spacing w:after="0" w:line="240" w:lineRule="auto"/>
+            </w:pPr>
+            <w:r>
+              <w:rPr>
+                <w:sz w:val="20"/>
+                <w:szCs w:val="20"/>
+              </w:rPr>
+              <w:t xml:space="preserve">11</w:t>
+            </w:r>
+          </w:p>
+        </w:tc>
+        <w:tc>
+          <w:tcPr>
+            <w:tcW w:w="1263" w:type="dxa"/>
+          </w:tcPr>
+          <w:p>
+            <w:pPr>
+              <w:spacing w:after="0" w:line="240" w:lineRule="auto"/>
+            </w:pPr>
+            <w:r>
+              <w:rPr>
+                <w:sz w:val="20"/>
+                <w:szCs w:val="20"/>
+              </w:rPr>
+              <w:t xml:space="preserve">10.21.0.22</w:t>
+            </w:r>
+          </w:p>
+        </w:tc>
+        <w:tc>
+          <w:tcPr>
+            <w:tcW w:w="812" w:type="dxa"/>
+          </w:tcPr>
+          <w:p>
+            <w:pPr>
+              <w:spacing w:after="0" w:line="240" w:lineRule="auto"/>
+            </w:pPr>
+            <w:r>
+              <w:rPr>
+                <w:sz w:val="20"/>
+                <w:szCs w:val="20"/>
+              </w:rPr>
+              <w:t xml:space="preserve">Done</w:t>
+            </w:r>
+          </w:p>
+        </w:tc>
+        <w:tc>
+          <w:tcPr>
+            <w:tcW w:w="3703" w:type="dxa"/>
+          </w:tcPr>
+          <w:p>
+            <w:pPr>
+              <w:spacing w:after="0" w:line="240" w:lineRule="auto"/>
+            </w:pPr>
+            <w:r>
+              <w:rPr>
+                <w:sz w:val="20"/>
+                <w:szCs w:val="20"/>
+              </w:rPr>
+              <w:t xml:space="preserve">1/1/1 tagged-only with 2000 - 2953</w:t>
+            </w:r>
+          </w:p>
+        </w:tc>
+      </w:tr>
+      <w:tr>
+        <w:trPr>
+          <w:cantSplit/>
+        </w:trPr>
+        <w:tc>
+          <w:tcPr>
+            <w:tcW w:w="2346" w:type="dxa"/>
+          </w:tcPr>
+          <w:p>
+            <w:pPr>
+              <w:spacing w:after="0" w:line="240" w:lineRule="auto"/>
+            </w:pPr>
+            <w:r>
+              <w:rPr>
+                <w:sz w:val="20"/>
+                <w:szCs w:val="20"/>
+              </w:rPr>
+              <w:t xml:space="preserve">switch-200V-LT2-3</w:t>
+            </w:r>
+          </w:p>
+        </w:tc>
+        <w:tc>
+          <w:tcPr>
+            <w:tcW w:w="902" w:type="dxa"/>
+          </w:tcPr>
+          <w:p>
+            <w:pPr>
+              <w:spacing w:after="0" w:line="240" w:lineRule="auto"/>
+            </w:pPr>
+            <w:r>
+              <w:rPr>
+                <w:sz w:val="20"/>
+                <w:szCs w:val="20"/>
+              </w:rPr>
+              <w:t xml:space="preserve">10</w:t>
+            </w:r>
+          </w:p>
+        </w:tc>
+        <w:tc>
+          <w:tcPr>
+            <w:tcW w:w="1263" w:type="dxa"/>
+          </w:tcPr>
+          <w:p>
+            <w:pPr>
+              <w:spacing w:after="0" w:line="240" w:lineRule="auto"/>
+            </w:pPr>
+            <w:r>
+              <w:rPr>
+                <w:sz w:val="20"/>
+                <w:szCs w:val="20"/>
+              </w:rPr>
+              <w:t xml:space="preserve">10.21.0.23</w:t>
+            </w:r>
+          </w:p>
+        </w:tc>
+        <w:tc>
+          <w:tcPr>
+            <w:tcW w:w="812" w:type="dxa"/>
+          </w:tcPr>
+          <w:p>
+            <w:pPr>
+              <w:spacing w:after="0" w:line="240" w:lineRule="auto"/>
+            </w:pPr>
+            <w:r>
+              <w:rPr>
+                <w:sz w:val="20"/>
+                <w:szCs w:val="20"/>
+              </w:rPr>
+              <w:t xml:space="preserve">Done</w:t>
+            </w:r>
+          </w:p>
+        </w:tc>
+        <w:tc>
+          <w:tcPr>
+            <w:tcW w:w="3703" w:type="dxa"/>
+          </w:tcPr>
+          <w:p>
+            <w:pPr>
+              <w:spacing w:after="0" w:line="240" w:lineRule="auto"/>
+            </w:pPr>
+            <w:r>
+              <w:rPr>
+                <w:sz w:val="20"/>
+                <w:szCs w:val="20"/>
+              </w:rPr>
+              <w:t xml:space="preserve"/>
+            </w:r>
+          </w:p>
+        </w:tc>
+      </w:tr>
+      <w:tr>
+        <w:trPr>
+          <w:cantSplit/>
+        </w:trPr>
+        <w:tc>
+          <w:tcPr>
+            <w:tcW w:w="2346" w:type="dxa"/>
+          </w:tcPr>
+          <w:p>
+            <w:pPr>
+              <w:spacing w:after="0" w:line="240" w:lineRule="auto"/>
+            </w:pPr>
+            <w:r>
+              <w:rPr>
+                <w:sz w:val="20"/>
+                <w:szCs w:val="20"/>
+              </w:rPr>
+              <w:t xml:space="preserve">switch-200V-8</w:t>
+            </w:r>
+          </w:p>
+        </w:tc>
+        <w:tc>
+          <w:tcPr>
+            <w:tcW w:w="902" w:type="dxa"/>
+          </w:tcPr>
+          <w:p>
+            <w:pPr>
+              <w:spacing w:after="0" w:line="240" w:lineRule="auto"/>
+            </w:pPr>
+            <w:r>
+              <w:rPr>
+                <w:sz w:val="20"/>
+                <w:szCs w:val="20"/>
+              </w:rPr>
+              <w:t xml:space="preserve">10</w:t>
+            </w:r>
+          </w:p>
+        </w:tc>
+        <w:tc>
+          <w:tcPr>
+            <w:tcW w:w="1263" w:type="dxa"/>
+          </w:tcPr>
+          <w:p>
+            <w:pPr>
+              <w:spacing w:after="0" w:line="240" w:lineRule="auto"/>
+            </w:pPr>
+            <w:r>
+              <w:rPr>
+                <w:sz w:val="20"/>
+                <w:szCs w:val="20"/>
+              </w:rPr>
+              <w:t xml:space="preserve">10.21.0.25</w:t>
+            </w:r>
+          </w:p>
+        </w:tc>
+        <w:tc>
+          <w:tcPr>
+            <w:tcW w:w="812" w:type="dxa"/>
+          </w:tcPr>
+          <w:p>
+            <w:pPr>
+              <w:spacing w:after="0" w:line="240" w:lineRule="auto"/>
+            </w:pPr>
+            <w:r>
+              <w:rPr>
+                <w:sz w:val="20"/>
+                <w:szCs w:val="20"/>
+              </w:rPr>
+              <w:t xml:space="preserve">Done</w:t>
+            </w:r>
+          </w:p>
+        </w:tc>
+        <w:tc>
+          <w:tcPr>
+            <w:tcW w:w="3703" w:type="dxa"/>
+          </w:tcPr>
+          <w:p>
+            <w:pPr>
+              <w:spacing w:after="0" w:line="240" w:lineRule="auto"/>
+            </w:pPr>
+            <w:r>
+              <w:rPr>
+                <w:sz w:val="20"/>
+                <w:szCs w:val="20"/>
+              </w:rPr>
+              <w:t xml:space="preserve">UPS cards (1/1/7 - 1/1/9) on 2000; DNS servers added</w:t>
+            </w:r>
+          </w:p>
+        </w:tc>
+      </w:tr>
+      <w:tr>
+        <w:trPr>
+          <w:cantSplit/>
+        </w:trPr>
+        <w:tc>
+          <w:tcPr>
+            <w:tcW w:w="2346" w:type="dxa"/>
+          </w:tcPr>
+          <w:p>
+            <w:pPr>
+              <w:spacing w:after="0" w:line="240" w:lineRule="auto"/>
+            </w:pPr>
+            <w:r>
+              <w:rPr>
+                <w:sz w:val="20"/>
+                <w:szCs w:val="20"/>
+              </w:rPr>
+              <w:t xml:space="preserve">switch-200V-LT2-1</w:t>
+            </w:r>
+          </w:p>
+        </w:tc>
+        <w:tc>
+          <w:tcPr>
+            <w:tcW w:w="902" w:type="dxa"/>
+          </w:tcPr>
+          <w:p>
+            <w:pPr>
+              <w:spacing w:after="0" w:line="240" w:lineRule="auto"/>
+            </w:pPr>
+            <w:r>
+              <w:rPr>
+                <w:sz w:val="20"/>
+                <w:szCs w:val="20"/>
+              </w:rPr>
+              <w:t xml:space="preserve">5</w:t>
+            </w:r>
+          </w:p>
+        </w:tc>
+        <w:tc>
+          <w:tcPr>
+            <w:tcW w:w="1263" w:type="dxa"/>
+          </w:tcPr>
+          <w:p>
+            <w:pPr>
+              <w:spacing w:after="0" w:line="240" w:lineRule="auto"/>
+            </w:pPr>
+            <w:r>
+              <w:rPr>
+                <w:sz w:val="20"/>
+                <w:szCs w:val="20"/>
+              </w:rPr>
+              <w:t xml:space="preserve">10.21.0.21</w:t>
+            </w:r>
+          </w:p>
+        </w:tc>
+        <w:tc>
+          <w:tcPr>
+            <w:tcW w:w="812" w:type="dxa"/>
+          </w:tcPr>
+          <w:p>
+            <w:pPr>
+              <w:spacing w:after="0" w:line="240" w:lineRule="auto"/>
+            </w:pPr>
+            <w:r>
+              <w:rPr>
+                <w:sz w:val="20"/>
+                <w:szCs w:val="20"/>
+              </w:rPr>
+              <w:t xml:space="preserve">Done</w:t>
+            </w:r>
+          </w:p>
+        </w:tc>
+        <w:tc>
+          <w:tcPr>
+            <w:tcW w:w="3703" w:type="dxa"/>
+          </w:tcPr>
+          <w:p>
+            <w:pPr>
+              <w:spacing w:after="0" w:line="240" w:lineRule="auto"/>
+            </w:pPr>
+            <w:r>
+              <w:rPr>
+                <w:sz w:val="20"/>
+                <w:szCs w:val="20"/>
+              </w:rPr>
+              <w:t xml:space="preserve"/>
+            </w:r>
+          </w:p>
+        </w:tc>
+      </w:tr>
+      <w:tr>
+        <w:trPr>
+          <w:cantSplit/>
+        </w:trPr>
+        <w:tc>
+          <w:tcPr>
+            <w:tcW w:w="2346" w:type="dxa"/>
+          </w:tcPr>
+          <w:p>
+            <w:pPr>
+              <w:spacing w:after="0" w:line="240" w:lineRule="auto"/>
+            </w:pPr>
+            <w:r>
+              <w:rPr>
+                <w:sz w:val="20"/>
+                <w:szCs w:val="20"/>
+              </w:rPr>
+              <w:t xml:space="preserve">switch-200V-Tutorial-6.03</w:t>
+            </w:r>
+          </w:p>
+        </w:tc>
+        <w:tc>
+          <w:tcPr>
+            <w:tcW w:w="902" w:type="dxa"/>
+          </w:tcPr>
+          <w:p>
+            <w:pPr>
+              <w:spacing w:after="0" w:line="240" w:lineRule="auto"/>
+            </w:pPr>
+            <w:r>
+              <w:rPr>
+                <w:sz w:val="20"/>
+                <w:szCs w:val="20"/>
+              </w:rPr>
+              <w:t xml:space="preserve">1</w:t>
+            </w:r>
+          </w:p>
+        </w:tc>
+        <w:tc>
+          <w:tcPr>
+            <w:tcW w:w="1263" w:type="dxa"/>
+          </w:tcPr>
+          <w:p>
+            <w:pPr>
+              <w:spacing w:after="0" w:line="240" w:lineRule="auto"/>
+            </w:pPr>
+            <w:r>
+              <w:rPr>
+                <w:sz w:val="20"/>
+                <w:szCs w:val="20"/>
+              </w:rPr>
+              <w:t xml:space="preserve">10.21.0.24</w:t>
+            </w:r>
+          </w:p>
+        </w:tc>
+        <w:tc>
+          <w:tcPr>
+            <w:tcW w:w="812" w:type="dxa"/>
+          </w:tcPr>
+          <w:p>
+            <w:pPr>
+              <w:spacing w:after="0" w:line="240" w:lineRule="auto"/>
+            </w:pPr>
+            <w:r>
+              <w:rPr>
+                <w:sz w:val="20"/>
+                <w:szCs w:val="20"/>
+              </w:rPr>
+              <w:t xml:space="preserve">Done</w:t>
+            </w:r>
+          </w:p>
+        </w:tc>
+        <w:tc>
+          <w:tcPr>
+            <w:tcW w:w="3703" w:type="dxa"/>
+          </w:tcPr>
+          <w:p>
+            <w:pPr>
+              <w:spacing w:after="0" w:line="240" w:lineRule="auto"/>
+            </w:pPr>
+            <w:r>
+              <w:rPr>
+                <w:sz w:val="20"/>
+                <w:szCs w:val="20"/>
+              </w:rPr>
+              <w:t xml:space="preserve"/>
+            </w:r>
+          </w:p>
+        </w:tc>
+      </w:tr>
+    </w:tbl>
+    <w:p>
+      <w:pPr>
+        <w:spacing w:after="80"/>
+      </w:pPr>
+    </w:p>
+    <w:p>
+      <w:r>
+        <w:t xml:space="preserve">Changes to the method during the change:</w:t>
+      </w:r>
+    </w:p>
+    <w:p>
+      <w:pPr>
+        <w:pStyle w:val="ListParagraph"/>
+        <w:numPr>
+          <w:ilvl w:val="0"/>
+          <w:numId w:val="1"/>
+        </w:numPr>
+        <w:spacing w:after="60"/>
+      </w:pPr>
+      <w:r>
+        <w:t xml:space="preserve">trinity200V-core cannot telnet or SSH to the access switches (its telnet client is disabled), so Part B was run from the SmartZone CLI and the admin jump host instead of a core-hop session. The jump host reaches the new 10.21.0.x addresses</w:t>
+      </w:r>
+    </w:p>
+    <w:p>
+      <w:pPr>
+        <w:pStyle w:val="ListParagraph"/>
+        <w:numPr>
+          <w:ilvl w:val="0"/>
+          <w:numId w:val="1"/>
+        </w:numPr>
+        <w:spacing w:after="60"/>
+      </w:pPr>
+      <w:r>
+        <w:t xml:space="preserve">A 10-minute reload timer (reload after 00:00:10) was set before each route change as a safety net and cancelled once the switch was reachable; it fired once (lv3) and restored the saved configuration</w:t>
+      </w:r>
+    </w:p>
+    <w:p>
+      <w:pPr>
+        <w:pStyle w:val="ListParagraph"/>
+        <w:numPr>
+          <w:ilvl w:val="0"/>
+          <w:numId w:val="1"/>
+        </w:numPr>
+        <w:spacing w:after="60"/>
+      </w:pPr>
+      <w:r>
+        <w:t xml:space="preserve">SmartZone accepted the switch from its new address only once the 192.168.122.x address was removed and the SmartZone agent restarted (manager disable / no manager disable). From LT2-2 onwards these were done in the same paste as the route change; reconnection took 2 - 3 minutes</w:t>
+      </w:r>
+    </w:p>
+    <w:p>
+      <w:r>
+        <w:t xml:space="preserve">Result: all eight switches are online in SmartZone on 10.21.0.20 - .27 with management source-interface ve 2000 and a default route via 10.21.0.1, and the 267 ports were changed as planned. No rollback was needed.</w:t>
+      </w:r>
+    </w:p>
+    <w:p>
+      <w:r>
+        <w:t xml:space="preserve">Follow-up:</w:t>
+      </w:r>
+    </w:p>
+    <w:p>
+      <w:pPr>
+        <w:pStyle w:val="ListParagraph"/>
+        <w:numPr>
+          <w:ilvl w:val="0"/>
+          <w:numId w:val="1"/>
+        </w:numPr>
+        <w:spacing w:after="60"/>
+      </w:pPr>
+      <w:r>
+        <w:t xml:space="preserve">Trinity to check the new DHCP leases of the three UPS cards (10.21.0.0/24) and update UPS monitoring</w:t>
+      </w:r>
+    </w:p>
+    <w:p>
+      <w:pPr>
+        <w:pStyle w:val="ListParagraph"/>
+        <w:numPr>
+          <w:ilvl w:val="0"/>
+          <w:numId w:val="1"/>
+        </w:numPr>
+        <w:spacing w:after="60"/>
+      </w:pPr>
+      <w:r>
+        <w:t xml:space="preserve">Trinity to check the device on lv6 1/1/32 (1C:1A:DF:C2:4F:5E) works on VL-staff-wired-01</w:t>
+      </w:r>
+    </w:p>
+    <w:p>
+      <w:pPr>
+        <w:pStyle w:val="ListParagraph"/>
+        <w:numPr>
+          <w:ilvl w:val="0"/>
+          <w:numId w:val="1"/>
+        </w:numPr>
+        <w:spacing w:after="60"/>
+      </w:pPr>
+      <w:r>
+        <w:t xml:space="preserve">Update the device list, monitoring and documentation entries for the switches from 192.168.122.x to 10.21.0.20 - .27</w:t>
+      </w:r>
+    </w:p>
+    <w:p>
+      <w:pPr>
+        <w:pStyle w:val="ListParagraph"/>
+        <w:numPr>
+          <w:ilvl w:val="0"/>
+          <w:numId w:val="1"/>
+        </w:numPr>
+        <w:spacing w:after="60"/>
+      </w:pPr>
+      <w:r>
+        <w:t xml:space="preserve">Trinity device sheet: 20:7B:D2:30:99:15 is on lv4 4/1/32 (SmartZone), not 2/1/24</w:t>
+      </w:r>
+    </w:p>
+    <w:p>
+      <w:pPr>
+        <w:pStyle w:val="ListParagraph"/>
+        <w:numPr>
+          <w:ilvl w:val="0"/>
+          <w:numId w:val="1"/>
+        </w:numPr>
+        <w:spacing w:after="60"/>
+      </w:pPr>
+      <w:r>
+        <w:t xml:space="preserve">Legacy VLANs (100, 230, 1212, 1213, 1230, 1240, 1250, 1271 - 1273) still tagged on uplinks and AP ports: separate clean-up change</w:t>
       </w:r>
     </w:p>
     <w:p>

</xml_diff>